<commit_message>
Cross-reference Check 11 from the report's Resolution Sensitivity section
The 5-minute finding (report Section 10, deck slide 13) was already
propagated in an earlier commit. This adds the one thing that didn't
exist yet at the time: a pointer to Check 11 in the main notebook,
which now documents the same finding as the one confirmed win among
its eleven robustness checks.

Co-Authored-By: Claude Sonnet 5 <noreply@anthropic.com>
</commit_message>
<xml_diff>
--- a/docs/capstone-btc-volatility-report.docx
+++ b/docs/capstone-btc-volatility-report.docx
@@ -5705,6 +5705,14 @@
     <w:p>
       <w:pPr>
         <w:pStyle w:val="FirstParagraph"/>
+      </w:pPr>
+      <w:r>
+        <w:t xml:space="preserve">This section’s live-test finding is also documented as Check 11 in the main notebook’s Robustness Checks — the one check, of eleven, that is a confirmed win rather than a rejected idea, kept in this separate companion pipeline by deliberate scope choice rather than because it failed validation.</w:t>
+      </w:r>
+    </w:p>
+    <w:p>
+      <w:pPr>
+        <w:pStyle w:val="BodyText"/>
       </w:pPr>
       <w:r>
         <w:t xml:space="preserve">Section 8.1 noted that positive-but-modest R² values deserve the same scrutiny suspiciously high ones do — and one direct question follows: how much of the gap between</w:t>

</xml_diff>

<commit_message>
Propagate Check 12 (LSTM) and backfill checks 8-10 into report and deck
Report: adds the LSTM finding (R2=-11.97, diagnosed via a naive-mean
baseline and a check for physically impossible negative predictions)
to Limitations, alongside three checks that were missing entirely -
log returns, winsorizing (including the self-correction story), and
the training-window sensitivity check.

Deck: the Conclusion slide's Limitations card was stale (only
mentioned 3 of what are now 12 checks) and Future Improvements still
listed "a genuine stacked ensemble" as open work, when it had already
been tried and failed. Replaced both with a compact, accurate summary
and swapped the stale bullet for on-chain metrics, the report's own
next-most-novel remaining idea.

Co-Authored-By: Claude Sonnet 5 <noreply@anthropic.com>
</commit_message>
<xml_diff>
--- a/docs/capstone-btc-volatility-report.docx
+++ b/docs/capstone-btc-volatility-report.docx
@@ -7220,6 +7220,66 @@
       </w:r>
       <w:r>
         <w:t xml:space="preserve">itself rather than the correction being wrong in principle (Section 10 tests the same underlying hypothesis a different way, successfully).</w:t>
+      </w:r>
+    </w:p>
+    <w:p>
+      <w:pPr>
+        <w:pStyle w:val="Compact"/>
+        <w:numPr>
+          <w:ilvl w:val="0"/>
+          <w:numId w:val="1003"/>
+        </w:numPr>
+      </w:pPr>
+      <w:r>
+        <w:t xml:space="preserve">Three further checks, in the same spirit: building the target from log returns instead of simple returns underperformed (R² 0.184 → 0.155); winsorizing extreme hourly-return moves in the regressors underperformed too (R² 0.184 → 0.070 historically, 0.061 → −0.076 live) — confirming the original Data Cleaning decision to retain extreme moves as genuine signal, and documented as an example of a real mistake caught and corrected (an earlier version of this check accidentally winsorized the training target as well, which inflated the apparent result before the error was found); and restricting training to 2020 onward made no meaningful difference (R² 0.184 → 0.185), corroborating a separate data-integrity check’s finding that pre-2020 timestamp gaps (0.17% of the training timeline) are not corrupting training.</w:t>
+      </w:r>
+    </w:p>
+    <w:p>
+      <w:pPr>
+        <w:pStyle w:val="Compact"/>
+        <w:numPr>
+          <w:ilvl w:val="0"/>
+          <w:numId w:val="1003"/>
+        </w:numPr>
+      </w:pPr>
+      <w:r>
+        <w:t xml:space="preserve">An LSTM given the full technical indicator set as a genuine 72-hour sequence — a second, architecturally different test of the</w:t>
+      </w:r>
+      <w:r>
+        <w:t xml:space="preserve"> </w:t>
+      </w:r>
+      <w:r>
+        <w:t xml:space="preserve">“why not LSTM”</w:t>
+      </w:r>
+      <w:r>
+        <w:t xml:space="preserve"> </w:t>
+      </w:r>
+      <w:r>
+        <w:t xml:space="preserve">design decision, alongside XGBoost’s tabular test — failed far more severely (R² = −11.97) than any other check. Diagnosed rather than left as a bare number: even an</w:t>
+      </w:r>
+      <w:r>
+        <w:t xml:space="preserve"> </w:t>
+      </w:r>
+      <w:r>
+        <w:t xml:space="preserve">“always predict the training mean”</w:t>
+      </w:r>
+      <w:r>
+        <w:t xml:space="preserve"> </w:t>
+      </w:r>
+      <w:r>
+        <w:t xml:space="preserve">baseline scores R² = −2.38 on the same test period, since the test period is measurably calmer than training; on top of that distribution shift, the LSTM’s own predictions were more widely spread than the training data itself and included 606 physically impossible negative</w:t>
+      </w:r>
+      <w:r>
+        <w:t xml:space="preserve"> </w:t>
+      </w:r>
+      <w:r>
+        <w:t xml:space="preserve">“volatility”</w:t>
+      </w:r>
+      <w:r>
+        <w:t xml:space="preserve"> </w:t>
+      </w:r>
+      <w:r>
+        <w:t xml:space="preserve">values, since nothing in a plain single-unit output layer constrains non-negativity. HAR-RV-X’s 30-day RV_month regressor’s longer averaging window handles the same distribution shift far better.</w:t>
       </w:r>
     </w:p>
     <w:p>

</xml_diff>

<commit_message>
Propagate Checks 15 and 16 into the report and deck
Report (docs/capstone-btc-volatility-report.docx/.pdf): Section 7.6
gets two new paragraphs - the stationary-feature-matrix fix (XGBoost
R2 -0.19 -> 0.01, ElasticNet R2 -0.21 -> -0.03, neither beating
HAR-RV-X) and the row-count-vs-time-aware rolling window diagnostic
(distorts affected rows substantially but touches zero test-window
rows). Section 12.1 Limitations gets a matching summary bullet.

Deck (presentation/capstone-btc-volatility.pptx): the aggregate check
count on slide 13's caption and slide 14's Limitations card updated
from fourteen/twelve to sixteen/fourteen.

Co-Authored-By: Claude Sonnet 5 <noreply@anthropic.com>
</commit_message>
<xml_diff>
--- a/docs/capstone-btc-volatility-report.docx
+++ b/docs/capstone-btc-volatility-report.docx
@@ -4305,6 +4305,300 @@
       </w:r>
       <w:r>
         <w:t xml:space="preserve">of signal HAR-RV-X’s own regressors already use — ATR and lagged realized volatility got the largest coefficients — but selecting only from raw single-hour lags rather than HAR-RV-X’s engineered multi-horizon (24h/168h/720h) averages, which a flat selection pass has no way to construct. Given access to up to 54 features, it still underperformed HAR-RV-X’s 4 hand-picked ones (R² −0.21 vs. 0.184). Not adopted.</w:t>
+      </w:r>
+    </w:p>
+    <w:p>
+      <w:pPr>
+        <w:pStyle w:val="BodyText"/>
+      </w:pPr>
+      <w:r>
+        <w:rPr>
+          <w:b/>
+          <w:bCs/>
+        </w:rPr>
+        <w:t xml:space="preserve">A stationary feature matrix for the generic-ML checks (a preprocessing fix, not a new feature).</w:t>
+      </w:r>
+      <w:r>
+        <w:t xml:space="preserve"> </w:t>
+      </w:r>
+      <w:r>
+        <w:t xml:space="preserve">The 54-feature matrix handed to XGBoost above and ElasticNet just above mixed non-stationary raw price/volume levels (</w:t>
+      </w:r>
+      <w:r>
+        <w:rPr>
+          <w:rStyle w:val="VerbatimChar"/>
+        </w:rPr>
+        <w:t xml:space="preserve">Open</w:t>
+      </w:r>
+      <w:r>
+        <w:t xml:space="preserve">,</w:t>
+      </w:r>
+      <w:r>
+        <w:t xml:space="preserve"> </w:t>
+      </w:r>
+      <w:r>
+        <w:rPr>
+          <w:rStyle w:val="VerbatimChar"/>
+        </w:rPr>
+        <w:t xml:space="preserve">High</w:t>
+      </w:r>
+      <w:r>
+        <w:t xml:space="preserve">,</w:t>
+      </w:r>
+      <w:r>
+        <w:t xml:space="preserve"> </w:t>
+      </w:r>
+      <w:r>
+        <w:rPr>
+          <w:rStyle w:val="VerbatimChar"/>
+        </w:rPr>
+        <w:t xml:space="preserve">Low</w:t>
+      </w:r>
+      <w:r>
+        <w:t xml:space="preserve">,</w:t>
+      </w:r>
+      <w:r>
+        <w:t xml:space="preserve"> </w:t>
+      </w:r>
+      <w:r>
+        <w:rPr>
+          <w:rStyle w:val="VerbatimChar"/>
+        </w:rPr>
+        <w:t xml:space="preserve">Close</w:t>
+      </w:r>
+      <w:r>
+        <w:t xml:space="preserve">,</w:t>
+      </w:r>
+      <w:r>
+        <w:t xml:space="preserve"> </w:t>
+      </w:r>
+      <w:r>
+        <w:rPr>
+          <w:rStyle w:val="VerbatimChar"/>
+        </w:rPr>
+        <w:t xml:space="preserve">Volume</w:t>
+      </w:r>
+      <w:r>
+        <w:t xml:space="preserve">,</w:t>
+      </w:r>
+      <w:r>
+        <w:t xml:space="preserve"> </w:t>
+      </w:r>
+      <w:r>
+        <w:rPr>
+          <w:rStyle w:val="VerbatimChar"/>
+        </w:rPr>
+        <w:t xml:space="preserve">ma_7d</w:t>
+      </w:r>
+      <w:r>
+        <w:t xml:space="preserve">,</w:t>
+      </w:r>
+      <w:r>
+        <w:t xml:space="preserve"> </w:t>
+      </w:r>
+      <w:r>
+        <w:rPr>
+          <w:rStyle w:val="VerbatimChar"/>
+        </w:rPr>
+        <w:t xml:space="preserve">ema_12</w:t>
+      </w:r>
+      <w:r>
+        <w:t xml:space="preserve">,</w:t>
+      </w:r>
+      <w:r>
+        <w:t xml:space="preserve"> </w:t>
+      </w:r>
+      <w:r>
+        <w:rPr>
+          <w:rStyle w:val="VerbatimChar"/>
+        </w:rPr>
+        <w:t xml:space="preserve">ema_26</w:t>
+      </w:r>
+      <w:r>
+        <w:t xml:space="preserve">, raw</w:t>
+      </w:r>
+      <w:r>
+        <w:t xml:space="preserve"> </w:t>
+      </w:r>
+      <w:r>
+        <w:rPr>
+          <w:rStyle w:val="VerbatimChar"/>
+        </w:rPr>
+        <w:t xml:space="preserve">atr_14</w:t>
+      </w:r>
+      <w:r>
+        <w:t xml:space="preserve"> </w:t>
+      </w:r>
+      <w:r>
+        <w:t xml:space="preserve">— all regime-dependent, ranging from roughly $4,000 to over $90,000 across this dataset) with genuinely stationary features (</w:t>
+      </w:r>
+      <w:r>
+        <w:rPr>
+          <w:rStyle w:val="VerbatimChar"/>
+        </w:rPr>
+        <w:t xml:space="preserve">hourly_return</w:t>
+      </w:r>
+      <w:r>
+        <w:t xml:space="preserve">,</w:t>
+      </w:r>
+      <w:r>
+        <w:t xml:space="preserve"> </w:t>
+      </w:r>
+      <w:r>
+        <w:rPr>
+          <w:rStyle w:val="VerbatimChar"/>
+        </w:rPr>
+        <w:t xml:space="preserve">atr_pct</w:t>
+      </w:r>
+      <w:r>
+        <w:t xml:space="preserve">,</w:t>
+      </w:r>
+      <w:r>
+        <w:t xml:space="preserve"> </w:t>
+      </w:r>
+      <w:r>
+        <w:rPr>
+          <w:rStyle w:val="VerbatimChar"/>
+        </w:rPr>
+        <w:t xml:space="preserve">rsi_14</w:t>
+      </w:r>
+      <w:r>
+        <w:t xml:space="preserve">, and others).</w:t>
+      </w:r>
+      <w:r>
+        <w:t xml:space="preserve"> </w:t>
+      </w:r>
+      <w:r>
+        <w:rPr>
+          <w:rStyle w:val="VerbatimChar"/>
+        </w:rPr>
+        <w:t xml:space="preserve">StandardScaler</w:t>
+      </w:r>
+      <w:r>
+        <w:t xml:space="preserve"> </w:t>
+      </w:r>
+      <w:r>
+        <w:t xml:space="preserve">doesn’t fix this — the problem is the underlying quantity drifting with BTC’s own price regime, not units, the same failure family as the ATR and ElasticNet scale bugs above. Dropping the 9 non-stationary base columns (27 of the original 54 lagged features remain) meaningfully improved both checks — XGBoost’s R² from −0.19 to 0.01, ElasticNet’s from −0.21 to −0.03 — without beating HAR-RV-X. The non-stationary levels were genuinely diluting the signal in both; removing them wasn’t enough to close the gap to HAR-RV-X’s engineered, multi-horizon regressors. Not adopted, but the improvement itself is the finding: preprocessing choices, not just model or feature choices, measurably moved these results.</w:t>
+      </w:r>
+    </w:p>
+    <w:p>
+      <w:pPr>
+        <w:pStyle w:val="BodyText"/>
+      </w:pPr>
+      <w:r>
+        <w:rPr>
+          <w:b/>
+          <w:bCs/>
+        </w:rPr>
+        <w:t xml:space="preserve">Row-count vs. time-aware rolling windows.</w:t>
+      </w:r>
+      <w:r>
+        <w:t xml:space="preserve"> </w:t>
+      </w:r>
+      <w:r>
+        <w:rPr>
+          <w:rStyle w:val="VerbatimChar"/>
+        </w:rPr>
+        <w:t xml:space="preserve">volatility_7d</w:t>
+      </w:r>
+      <w:r>
+        <w:t xml:space="preserve"> </w:t>
+      </w:r>
+      <w:r>
+        <w:t xml:space="preserve">is built with an integer</w:t>
+      </w:r>
+      <w:r>
+        <w:t xml:space="preserve"> </w:t>
+      </w:r>
+      <w:r>
+        <w:rPr>
+          <w:rStyle w:val="VerbatimChar"/>
+        </w:rPr>
+        <w:t xml:space="preserve">rolling(168)</w:t>
+      </w:r>
+      <w:r>
+        <w:t xml:space="preserve"> </w:t>
+      </w:r>
+      <w:r>
+        <w:t xml:space="preserve">window (168 rows), not a time-aware one — this notebook’s data never carries a</w:t>
+      </w:r>
+      <w:r>
+        <w:t xml:space="preserve"> </w:t>
+      </w:r>
+      <w:r>
+        <w:rPr>
+          <w:rStyle w:val="VerbatimChar"/>
+        </w:rPr>
+        <w:t xml:space="preserve">DatetimeIndex</w:t>
+      </w:r>
+      <w:r>
+        <w:t xml:space="preserve">, so</w:t>
+      </w:r>
+      <w:r>
+        <w:t xml:space="preserve"> </w:t>
+      </w:r>
+      <w:r>
+        <w:rPr>
+          <w:rStyle w:val="VerbatimChar"/>
+        </w:rPr>
+        <w:t xml:space="preserve">rolling()</w:t>
+      </w:r>
+      <w:r>
+        <w:t xml:space="preserve"> </w:t>
+      </w:r>
+      <w:r>
+        <w:t xml:space="preserve">has no notion of the</w:t>
+      </w:r>
+      <w:r>
+        <w:t xml:space="preserve"> </w:t>
+      </w:r>
+      <w:r>
+        <w:rPr>
+          <w:rStyle w:val="VerbatimChar"/>
+        </w:rPr>
+        <w:t xml:space="preserve">Date</w:t>
+      </w:r>
+      <w:r>
+        <w:t xml:space="preserve"> </w:t>
+      </w:r>
+      <w:r>
+        <w:t xml:space="preserve">column at all. A separate data-integrity check found 27 of 28 timestamp gaps in the raw feed, concentrated in 2017–2021; near any gap, a</w:t>
+      </w:r>
+      <w:r>
+        <w:t xml:space="preserve"> </w:t>
+      </w:r>
+      <w:r>
+        <w:t xml:space="preserve">“168-row”</w:t>
+      </w:r>
+      <w:r>
+        <w:t xml:space="preserve"> </w:t>
+      </w:r>
+      <w:r>
+        <w:t xml:space="preserve">window silently spans more than 168 real hours. Measured directly rather than assumed: 4,722 of 73,111 rows differ at all between a genuine time-aware</w:t>
+      </w:r>
+      <w:r>
+        <w:t xml:space="preserve"> </w:t>
+      </w:r>
+      <w:r>
+        <w:rPr>
+          <w:rStyle w:val="VerbatimChar"/>
+        </w:rPr>
+        <w:t xml:space="preserve">'168h'</w:t>
+      </w:r>
+      <w:r>
+        <w:t xml:space="preserve"> </w:t>
+      </w:r>
+      <w:r>
+        <w:t xml:space="preserve">window and the row-based one used throughout this notebook, by up to 83.6% on individual affected rows. But every affected row falls in that same 2017–2021, training-only history — zero fall inside the held-out test window — so the distortion has no measurable effect on any number this report reports. Worth fixing for correctness in a production system (</w:t>
+      </w:r>
+      <w:r>
+        <w:rPr>
+          <w:rStyle w:val="VerbatimChar"/>
+        </w:rPr>
+        <w:t xml:space="preserve">set_index('Date').rolling('168h')</w:t>
+      </w:r>
+      <w:r>
+        <w:t xml:space="preserve">), but there is nothing to adopt here: it wouldn’t change a single reported result.</w:t>
       </w:r>
     </w:p>
     <w:p>
@@ -7533,6 +7827,135 @@
       </w:r>
       <w:r>
         <w:t xml:space="preserve">help and changed the actual kept model: adding EWMA’s own tuned sigma and realized skewness as two further HAR-RV-X regressors improved R² on both the historical split (0.184 → 0.199) and the live-test window (0.061 → 0.122) — validated on live data before being promoted, unlike the winsorizing false start above. Automated feature selection (ElasticNet over the full 54-feature set) and three alternative realized-volatility estimators (Parkinson, Garman-Klass, Rogers-Satchell) were also tested as further regressors and did not improve performance (Section 7.6). Full details in Section 7.4.4.</w:t>
+      </w:r>
+    </w:p>
+    <w:p>
+      <w:pPr>
+        <w:pStyle w:val="Compact"/>
+        <w:numPr>
+          <w:ilvl w:val="0"/>
+          <w:numId w:val="1003"/>
+        </w:numPr>
+      </w:pPr>
+      <w:r>
+        <w:t xml:space="preserve">Two preprocessing-stage checks, distinct from every feature/model check above. Dropping 9 non-stationary raw price/volume-level columns (</w:t>
+      </w:r>
+      <w:r>
+        <w:rPr>
+          <w:rStyle w:val="VerbatimChar"/>
+        </w:rPr>
+        <w:t xml:space="preserve">Open</w:t>
+      </w:r>
+      <w:r>
+        <w:t xml:space="preserve">,</w:t>
+      </w:r>
+      <w:r>
+        <w:t xml:space="preserve"> </w:t>
+      </w:r>
+      <w:r>
+        <w:rPr>
+          <w:rStyle w:val="VerbatimChar"/>
+        </w:rPr>
+        <w:t xml:space="preserve">High</w:t>
+      </w:r>
+      <w:r>
+        <w:t xml:space="preserve">,</w:t>
+      </w:r>
+      <w:r>
+        <w:t xml:space="preserve"> </w:t>
+      </w:r>
+      <w:r>
+        <w:rPr>
+          <w:rStyle w:val="VerbatimChar"/>
+        </w:rPr>
+        <w:t xml:space="preserve">Low</w:t>
+      </w:r>
+      <w:r>
+        <w:t xml:space="preserve">,</w:t>
+      </w:r>
+      <w:r>
+        <w:t xml:space="preserve"> </w:t>
+      </w:r>
+      <w:r>
+        <w:rPr>
+          <w:rStyle w:val="VerbatimChar"/>
+        </w:rPr>
+        <w:t xml:space="preserve">Close</w:t>
+      </w:r>
+      <w:r>
+        <w:t xml:space="preserve">,</w:t>
+      </w:r>
+      <w:r>
+        <w:t xml:space="preserve"> </w:t>
+      </w:r>
+      <w:r>
+        <w:rPr>
+          <w:rStyle w:val="VerbatimChar"/>
+        </w:rPr>
+        <w:t xml:space="preserve">Volume</w:t>
+      </w:r>
+      <w:r>
+        <w:t xml:space="preserve">,</w:t>
+      </w:r>
+      <w:r>
+        <w:t xml:space="preserve"> </w:t>
+      </w:r>
+      <w:r>
+        <w:rPr>
+          <w:rStyle w:val="VerbatimChar"/>
+        </w:rPr>
+        <w:t xml:space="preserve">ma_7d</w:t>
+      </w:r>
+      <w:r>
+        <w:t xml:space="preserve">,</w:t>
+      </w:r>
+      <w:r>
+        <w:t xml:space="preserve"> </w:t>
+      </w:r>
+      <w:r>
+        <w:rPr>
+          <w:rStyle w:val="VerbatimChar"/>
+        </w:rPr>
+        <w:t xml:space="preserve">ema_12</w:t>
+      </w:r>
+      <w:r>
+        <w:t xml:space="preserve">,</w:t>
+      </w:r>
+      <w:r>
+        <w:t xml:space="preserve"> </w:t>
+      </w:r>
+      <w:r>
+        <w:rPr>
+          <w:rStyle w:val="VerbatimChar"/>
+        </w:rPr>
+        <w:t xml:space="preserve">ema_26</w:t>
+      </w:r>
+      <w:r>
+        <w:t xml:space="preserve">, raw</w:t>
+      </w:r>
+      <w:r>
+        <w:t xml:space="preserve"> </w:t>
+      </w:r>
+      <w:r>
+        <w:rPr>
+          <w:rStyle w:val="VerbatimChar"/>
+        </w:rPr>
+        <w:t xml:space="preserve">atr_14</w:t>
+      </w:r>
+      <w:r>
+        <w:t xml:space="preserve">) from the 54-feature matrix meaningfully improved both XGBoost (R² −0.19 → 0.01) and ElasticNet (R² −0.21 → −0.03), without beating HAR-RV-X — confirming those levels were diluting the signal, just not enough to close the gap (Section 7.6). Separately,</w:t>
+      </w:r>
+      <w:r>
+        <w:t xml:space="preserve"> </w:t>
+      </w:r>
+      <w:r>
+        <w:rPr>
+          <w:rStyle w:val="VerbatimChar"/>
+        </w:rPr>
+        <w:t xml:space="preserve">volatility_7d</w:t>
+      </w:r>
+      <w:r>
+        <w:t xml:space="preserve">’s row-count rolling window (rather than a time-aware one) does distort results substantially near the 28 known timestamp gaps (up to 83.6% relative difference on affected rows) — but every affected row falls in 2017–2021 training-only history, with zero inside the held-out test window, so it changes nothing this report reports (Section 7.6).</w:t>
       </w:r>
     </w:p>
     <w:p>

</xml_diff>

<commit_message>
Propagate the 5-min companion's HAR-RV-X promotion into report and deck
Report Section 10 (Resolution Sensitivity): Table 3/4's 5-minute
HAR-RV-X row and the discussion text updated to the companion
notebook's own promoted numbers (R2 0.1508 historical, 0.2401 live) -
both resolutions now reflect the same Check-14 promotion rather than
just the hourly side. Also fixed a stale "one check, of eleven" count
in the section intro that was never updated across several rounds of
check additions.

Deck slide 13 (Resolution Sensitivity): same numbers and framing
update, with the caption trimmed to fit its text box after the first
draft overflowed.

Co-Authored-By: Claude Sonnet 5 <noreply@anthropic.com>
</commit_message>
<xml_diff>
--- a/docs/capstone-btc-volatility-report.docx
+++ b/docs/capstone-btc-volatility-report.docx
@@ -6274,7 +6274,7 @@
         <w:pStyle w:val="FirstParagraph"/>
       </w:pPr>
       <w:r>
-        <w:t xml:space="preserve">This section’s live-test finding is also documented as Check 11 in the main notebook’s Robustness Checks — the one check, of eleven, that is a confirmed win rather than a rejected idea, kept in this separate companion pipeline by deliberate scope choice rather than because it failed validation.</w:t>
+        <w:t xml:space="preserve">This section’s live-test finding is also documented as Check 11 in the main notebook’s Robustness Checks — one of two checks, out of sixteen, that survived validation rather than being rejected, kept in this separate companion pipeline by deliberate scope choice rather than because it failed validation.</w:t>
       </w:r>
     </w:p>
     <w:p>
@@ -6614,40 +6614,40 @@
               <w:pStyle w:val="Compact"/>
             </w:pPr>
             <w:r>
-              <w:t xml:space="preserve">0.019179</w:t>
-            </w:r>
-          </w:p>
-        </w:tc>
-        <w:tc>
-          <w:tcPr/>
-          <w:p>
-            <w:pPr>
-              <w:pStyle w:val="Compact"/>
-            </w:pPr>
-            <w:r>
-              <w:t xml:space="preserve">0.014756</w:t>
-            </w:r>
-          </w:p>
-        </w:tc>
-        <w:tc>
-          <w:tcPr/>
-          <w:p>
-            <w:pPr>
-              <w:pStyle w:val="Compact"/>
-            </w:pPr>
-            <w:r>
-              <w:t xml:space="preserve">0.1419</w:t>
-            </w:r>
-          </w:p>
-        </w:tc>
-        <w:tc>
-          <w:tcPr/>
-          <w:p>
-            <w:pPr>
-              <w:pStyle w:val="Compact"/>
-            </w:pPr>
-            <w:r>
-              <w:t xml:space="preserve">24.15%</w:t>
+              <w:t xml:space="preserve">0.019105</w:t>
+            </w:r>
+          </w:p>
+        </w:tc>
+        <w:tc>
+          <w:tcPr/>
+          <w:p>
+            <w:pPr>
+              <w:pStyle w:val="Compact"/>
+            </w:pPr>
+            <w:r>
+              <w:t xml:space="preserve">0.014642</w:t>
+            </w:r>
+          </w:p>
+        </w:tc>
+        <w:tc>
+          <w:tcPr/>
+          <w:p>
+            <w:pPr>
+              <w:pStyle w:val="Compact"/>
+            </w:pPr>
+            <w:r>
+              <w:t xml:space="preserve">0.1508</w:t>
+            </w:r>
+          </w:p>
+        </w:tc>
+        <w:tc>
+          <w:tcPr/>
+          <w:p>
+            <w:pPr>
+              <w:pStyle w:val="Compact"/>
+            </w:pPr>
+            <w:r>
+              <w:t xml:space="preserve">23.84%</w:t>
             </w:r>
           </w:p>
         </w:tc>
@@ -7120,40 +7120,40 @@
               <w:pStyle w:val="Compact"/>
             </w:pPr>
             <w:r>
-              <w:t xml:space="preserve">0.019080</w:t>
-            </w:r>
-          </w:p>
-        </w:tc>
-        <w:tc>
-          <w:tcPr/>
-          <w:p>
-            <w:pPr>
-              <w:pStyle w:val="Compact"/>
-            </w:pPr>
-            <w:r>
-              <w:t xml:space="preserve">0.015477</w:t>
-            </w:r>
-          </w:p>
-        </w:tc>
-        <w:tc>
-          <w:tcPr/>
-          <w:p>
-            <w:pPr>
-              <w:pStyle w:val="Compact"/>
-            </w:pPr>
-            <w:r>
-              <w:t xml:space="preserve">0.2043</w:t>
-            </w:r>
-          </w:p>
-        </w:tc>
-        <w:tc>
-          <w:tcPr/>
-          <w:p>
-            <w:pPr>
-              <w:pStyle w:val="Compact"/>
-            </w:pPr>
-            <w:r>
-              <w:t xml:space="preserve">27.15%</w:t>
+              <w:t xml:space="preserve">0.018645</w:t>
+            </w:r>
+          </w:p>
+        </w:tc>
+        <w:tc>
+          <w:tcPr/>
+          <w:p>
+            <w:pPr>
+              <w:pStyle w:val="Compact"/>
+            </w:pPr>
+            <w:r>
+              <w:t xml:space="preserve">0.014949</w:t>
+            </w:r>
+          </w:p>
+        </w:tc>
+        <w:tc>
+          <w:tcPr/>
+          <w:p>
+            <w:pPr>
+              <w:pStyle w:val="Compact"/>
+            </w:pPr>
+            <w:r>
+              <w:t xml:space="preserve">0.2401</w:t>
+            </w:r>
+          </w:p>
+        </w:tc>
+        <w:tc>
+          <w:tcPr/>
+          <w:p>
+            <w:pPr>
+              <w:pStyle w:val="Compact"/>
+            </w:pPr>
+            <w:r>
+              <w:t xml:space="preserve">26.11%</w:t>
             </w:r>
           </w:p>
         </w:tc>
@@ -7448,7 +7448,7 @@
         <w:pStyle w:val="BodyText"/>
       </w:pPr>
       <w:r>
-        <w:t xml:space="preserve">Both HAR-RV-X and EWMA improve on the live test, though by very different margins now that HAR-RV-X’s own hourly baseline is stronger (Section 7.4.4): HAR-RV-X’s R² goes from 0.1217 to 0.2043 (about 1.7x), while EWMA’s improves far more, from 0.013 to 0.147 (about 11x) - closing most of the gap to HAR-RV-X that exists at hourly resolution. The historical split is a more mixed, honestly-reported result: HAR-RV-X dips from 0.1992 to 0.1419 (a bigger dip than it used to be, now that the hourly comparison point is the stronger, Section-7.4.4-promoted version) and EWMA drops more (0.059 to 0.006). This pattern is consistent with the interpretation that measurement noise matters more for a model evaluated further from the training distribution (live data, roughly eight months out) than for one evaluated on an adjacent historical split - not a contradiction of the underlying hypothesis, but a real nuance in it.</w:t>
+        <w:t xml:space="preserve">Both HAR-RV-X and EWMA improve on the live test. HAR-RV-X’s own Section 7.4.4 promotion (EWMA’s tuned sigma and realized skewness as two further regressors) has since been ported into this 5-minute companion pipeline too, so both rows in the table above reflect the same underlying model - not an artifact of promoting one resolution and not the other. HAR-RV-X’s R² goes from 0.1217 to 0.2401 (about 2.0x), while EWMA’s improves far more, from 0.013 to 0.147 (about 11x) - closing most of the gap to HAR-RV-X that exists at hourly resolution. The historical split is a more mixed, honestly-reported result: HAR-RV-X dips from 0.1992 to 0.1508 and EWMA drops more (0.059 to 0.006). This pattern is consistent with the interpretation that measurement noise matters more for a model evaluated further from the training distribution (live data, roughly eight months out) than for one evaluated on an adjacent historical split - not a contradiction of the underlying hypothesis, but a real nuance in it.</w:t>
       </w:r>
     </w:p>
     <w:p>

</xml_diff>

<commit_message>
Add a worked position-sizing/VaR use case to the report
New Section 11.1, grounded in the model's actual most recent live
forecast rather than a hypothetical number: scales the hourly
volatility_7d forecast to a 7-day horizon, sizes a position off a
fixed risk budget, derives a 95% VaR figure, and notes the
volatility-arbitrage angle against options-implied vol. Closes with
an honest accounting of why this is one input to a risk desk's
process rather than the risk number itself - live R2/MAPE, the
model's backward-looking nature, and GARCH's own catastrophic failure
at this horizon as a reminder the "textbook" choice would have been
worse, not just mediocre.

Co-Authored-By: Claude Sonnet 5 <noreply@anthropic.com>
</commit_message>
<xml_diff>
--- a/docs/capstone-btc-volatility-report.docx
+++ b/docs/capstone-btc-volatility-report.docx
@@ -7617,7 +7617,7 @@
     </w:p>
     <w:bookmarkEnd w:id="67"/>
     <w:bookmarkEnd w:id="68"/>
-    <w:bookmarkStart w:id="69" w:name="conclusion"/>
+    <w:bookmarkStart w:id="70" w:name="conclusion"/>
     <w:p>
       <w:pPr>
         <w:pStyle w:val="Heading1"/>
@@ -7666,8 +7666,459 @@
         <w:t xml:space="preserve">Taken together, this answers the project’s central objectives: session-time effects are not statistically significant (p = 1.0000, independently corroborated by Holt-Winters’ own seasonal parameter converging to zero), autocorrelation in volatility is real and persistent (ADF p &lt; 0.0001), and once both the target-construction artifact and a real feature-scaling bug were found and fixed - and, later, three more validated improvements were combined and promoted - a genuinely working, and now meaningfully more accurate, honestly-validated forecasting model emerged, which is a more useful capstone result than an artificially perfect one would have been.</w:t>
       </w:r>
     </w:p>
+    <w:bookmarkStart w:id="69" w:name="X0b43c62fd49ddc73138c73255c93c0c5b6ea879"/>
+    <w:p>
+      <w:pPr>
+        <w:pStyle w:val="Heading2"/>
+      </w:pPr>
+      <w:r>
+        <w:t xml:space="preserve">11.1 Worked Example: Position Sizing and Value-at-Risk</w:t>
+      </w:r>
+    </w:p>
+    <w:p>
+      <w:pPr>
+        <w:pStyle w:val="FirstParagraph"/>
+      </w:pPr>
+      <w:r>
+        <w:t xml:space="preserve">Section 1.3 named Value-at-Risk and position sizing as downstream use cases in the abstract. This section makes that concrete, using the model’s own most recent live forecast rather than a hypothetical number: on 2026-08-25, HAR-RV-X’s kept model forecast</w:t>
+      </w:r>
+      <w:r>
+        <w:t xml:space="preserve"> </w:t>
+      </w:r>
+      <w:r>
+        <w:rPr>
+          <w:rStyle w:val="VerbatimChar"/>
+        </w:rPr>
+        <w:t xml:space="preserve">volatility_7d = 0.004685</w:t>
+      </w:r>
+      <w:r>
+        <w:t xml:space="preserve"> </w:t>
+      </w:r>
+      <w:r>
+        <w:t xml:space="preserve">— a predicted standard deviation of</w:t>
+      </w:r>
+      <w:r>
+        <w:t xml:space="preserve"> </w:t>
+      </w:r>
+      <w:r>
+        <w:rPr>
+          <w:i/>
+          <w:iCs/>
+        </w:rPr>
+        <w:t xml:space="preserve">hourly</w:t>
+      </w:r>
+      <w:r>
+        <w:t xml:space="preserve"> </w:t>
+      </w:r>
+      <w:r>
+        <w:t xml:space="preserve">returns over the coming 7 days.</w:t>
+      </w:r>
+    </w:p>
+    <w:p>
+      <w:pPr>
+        <w:pStyle w:val="BodyText"/>
+      </w:pPr>
+      <w:r>
+        <w:rPr>
+          <w:b/>
+          <w:bCs/>
+        </w:rPr>
+        <w:t xml:space="preserve">Step 1 — scale to the trade’s horizon.</w:t>
+      </w:r>
+      <w:r>
+        <w:t xml:space="preserve"> </w:t>
+      </w:r>
+      <w:r>
+        <w:t xml:space="preserve">A 7-day directional position needs 7-day σ, not hourly σ. Scaling by √time (treating hourly returns as approximately independent over the window):</w:t>
+      </w:r>
+    </w:p>
+    <w:p>
+      <w:pPr>
+        <w:pStyle w:val="BodyText"/>
+      </w:pPr>
+      <m:oMathPara>
+        <m:oMathParaPr>
+          <m:jc m:val="center"/>
+        </m:oMathParaPr>
+        <m:oMath>
+          <m:sSub>
+            <m:e>
+              <m:r>
+                <m:t>σ</m:t>
+              </m:r>
+            </m:e>
+            <m:sub>
+              <m:r>
+                <m:t>7</m:t>
+              </m:r>
+              <m:r>
+                <m:t>d</m:t>
+              </m:r>
+            </m:sub>
+          </m:sSub>
+          <m:r>
+            <m:rPr>
+              <m:sty m:val="p"/>
+            </m:rPr>
+            <m:t>=</m:t>
+          </m:r>
+          <m:r>
+            <m:t>0.004685</m:t>
+          </m:r>
+          <m:r>
+            <m:rPr>
+              <m:sty m:val="p"/>
+            </m:rPr>
+            <m:t>×</m:t>
+          </m:r>
+          <m:rad>
+            <m:radPr>
+              <m:degHide m:val="on"/>
+            </m:radPr>
+            <m:deg/>
+            <m:e>
+              <m:r>
+                <m:t>168</m:t>
+              </m:r>
+            </m:e>
+          </m:rad>
+          <m:r>
+            <m:rPr>
+              <m:sty m:val="p"/>
+            </m:rPr>
+            <m:t>≈</m:t>
+          </m:r>
+          <m:r>
+            <m:t>6.07</m:t>
+          </m:r>
+          <m:r>
+            <m:rPr>
+              <m:sty m:val="p"/>
+            </m:rPr>
+            <m:t>%</m:t>
+          </m:r>
+        </m:oMath>
+      </m:oMathPara>
+    </w:p>
+    <w:p>
+      <w:pPr>
+        <w:pStyle w:val="FirstParagraph"/>
+      </w:pPr>
+      <w:r>
+        <w:rPr>
+          <w:b/>
+          <w:bCs/>
+        </w:rPr>
+        <w:t xml:space="preserve">Step 2 — size the position off a risk budget, not a price target.</w:t>
+      </w:r>
+      <w:r>
+        <w:t xml:space="preserve"> </w:t>
+      </w:r>
+      <w:r>
+        <w:t xml:space="preserve">Suppose a desk is willing to risk $50,000 (one standard deviation) on a 7-day BTC position:</w:t>
+      </w:r>
+    </w:p>
+    <w:p>
+      <w:pPr>
+        <w:pStyle w:val="BodyText"/>
+      </w:pPr>
+      <m:oMathPara>
+        <m:oMathParaPr>
+          <m:jc m:val="center"/>
+        </m:oMathParaPr>
+        <m:oMath>
+          <m:r>
+            <m:rPr>
+              <m:nor/>
+              <m:sty m:val="p"/>
+            </m:rPr>
+            <m:t>Notional</m:t>
+          </m:r>
+          <m:r>
+            <m:rPr>
+              <m:sty m:val="p"/>
+            </m:rPr>
+            <m:t>=</m:t>
+          </m:r>
+          <m:f>
+            <m:fPr>
+              <m:type m:val="bar"/>
+            </m:fPr>
+            <m:num>
+              <m:r>
+                <m:rPr>
+                  <m:sty m:val="p"/>
+                </m:rPr>
+                <m:t>$</m:t>
+              </m:r>
+              <m:r>
+                <m:t>50</m:t>
+              </m:r>
+              <m:r>
+                <m:rPr>
+                  <m:sty m:val="p"/>
+                </m:rPr>
+                <m:t>,</m:t>
+              </m:r>
+              <m:r>
+                <m:t>000</m:t>
+              </m:r>
+            </m:num>
+            <m:den>
+              <m:r>
+                <m:t>0.0607</m:t>
+              </m:r>
+            </m:den>
+          </m:f>
+          <m:r>
+            <m:rPr>
+              <m:sty m:val="p"/>
+            </m:rPr>
+            <m:t>≈</m:t>
+          </m:r>
+          <m:r>
+            <m:rPr>
+              <m:sty m:val="p"/>
+            </m:rPr>
+            <m:t>$</m:t>
+          </m:r>
+          <m:r>
+            <m:t>823</m:t>
+          </m:r>
+          <m:r>
+            <m:rPr>
+              <m:sty m:val="p"/>
+            </m:rPr>
+            <m:t>,</m:t>
+          </m:r>
+          <m:r>
+            <m:t>000</m:t>
+          </m:r>
+        </m:oMath>
+      </m:oMathPara>
+    </w:p>
+    <w:p>
+      <w:pPr>
+        <w:pStyle w:val="FirstParagraph"/>
+      </w:pPr>
+      <w:r>
+        <w:t xml:space="preserve">A larger forecasted σ shrinks the position automatically — this is the actual mechanism behind volatility targeting: the model doesn’t predict direction, it sizes exposure so realized risk stays roughly constant regardless of how turbulent the market currently is.</w:t>
+      </w:r>
+    </w:p>
+    <w:p>
+      <w:pPr>
+        <w:pStyle w:val="BodyText"/>
+      </w:pPr>
+      <w:r>
+        <w:rPr>
+          <w:b/>
+          <w:bCs/>
+        </w:rPr>
+        <w:t xml:space="preserve">Step 3 — turn that into a VaR figure.</w:t>
+      </w:r>
+      <w:r>
+        <w:t xml:space="preserve"> </w:t>
+      </w:r>
+      <w:r>
+        <w:t xml:space="preserve">95% one-week Value-at-Risk on the resulting position:</w:t>
+      </w:r>
+    </w:p>
+    <w:p>
+      <w:pPr>
+        <w:pStyle w:val="BodyText"/>
+      </w:pPr>
+      <m:oMathPara>
+        <m:oMathParaPr>
+          <m:jc m:val="center"/>
+        </m:oMathParaPr>
+        <m:oMath>
+          <m:r>
+            <m:t>V</m:t>
+          </m:r>
+          <m:r>
+            <m:t>a</m:t>
+          </m:r>
+          <m:sSub>
+            <m:e>
+              <m:r>
+                <m:t>R</m:t>
+              </m:r>
+            </m:e>
+            <m:sub>
+              <m:r>
+                <m:t>95</m:t>
+              </m:r>
+            </m:sub>
+          </m:sSub>
+          <m:r>
+            <m:rPr>
+              <m:sty m:val="p"/>
+            </m:rPr>
+            <m:t>=</m:t>
+          </m:r>
+          <m:r>
+            <m:rPr>
+              <m:sty m:val="p"/>
+            </m:rPr>
+            <m:t>$</m:t>
+          </m:r>
+          <m:r>
+            <m:t>823</m:t>
+          </m:r>
+          <m:r>
+            <m:rPr>
+              <m:sty m:val="p"/>
+            </m:rPr>
+            <m:t>,</m:t>
+          </m:r>
+          <m:r>
+            <m:t>000</m:t>
+          </m:r>
+          <m:r>
+            <m:rPr>
+              <m:sty m:val="p"/>
+            </m:rPr>
+            <m:t>×</m:t>
+          </m:r>
+          <m:r>
+            <m:t>0.0607</m:t>
+          </m:r>
+          <m:r>
+            <m:rPr>
+              <m:sty m:val="p"/>
+            </m:rPr>
+            <m:t>×</m:t>
+          </m:r>
+          <m:r>
+            <m:t>1.645</m:t>
+          </m:r>
+          <m:r>
+            <m:rPr>
+              <m:sty m:val="p"/>
+            </m:rPr>
+            <m:t>≈</m:t>
+          </m:r>
+          <m:r>
+            <m:rPr>
+              <m:sty m:val="p"/>
+            </m:rPr>
+            <m:t>$</m:t>
+          </m:r>
+          <m:r>
+            <m:t>82</m:t>
+          </m:r>
+          <m:r>
+            <m:rPr>
+              <m:sty m:val="p"/>
+            </m:rPr>
+            <m:t>,</m:t>
+          </m:r>
+          <m:r>
+            <m:t>200</m:t>
+          </m:r>
+        </m:oMath>
+      </m:oMathPara>
+    </w:p>
+    <w:p>
+      <w:pPr>
+        <w:pStyle w:val="FirstParagraph"/>
+      </w:pPr>
+      <w:r>
+        <w:t xml:space="preserve">— read as</w:t>
+      </w:r>
+      <w:r>
+        <w:t xml:space="preserve"> </w:t>
+      </w:r>
+      <w:r>
+        <w:t xml:space="preserve">“a 5% chance of losing more than $82,200 over the next 7 days,”</w:t>
+      </w:r>
+      <w:r>
+        <w:t xml:space="preserve"> </w:t>
+      </w:r>
+      <w:r>
+        <w:t xml:space="preserve">the figure that would actually appear in a risk report.</w:t>
+      </w:r>
+    </w:p>
+    <w:p>
+      <w:pPr>
+        <w:pStyle w:val="BodyText"/>
+      </w:pPr>
+      <w:r>
+        <w:rPr>
+          <w:b/>
+          <w:bCs/>
+        </w:rPr>
+        <w:t xml:space="preserve">Step 4 — a volatility-arbitrage angle.</w:t>
+      </w:r>
+      <w:r>
+        <w:t xml:space="preserve"> </w:t>
+      </w:r>
+      <w:r>
+        <w:t xml:space="preserve">This is a</w:t>
+      </w:r>
+      <w:r>
+        <w:t xml:space="preserve"> </w:t>
+      </w:r>
+      <w:r>
+        <w:rPr>
+          <w:i/>
+          <w:iCs/>
+        </w:rPr>
+        <w:t xml:space="preserve">realized</w:t>
+      </w:r>
+      <w:r>
+        <w:t xml:space="preserve">-volatility forecast; comparing it against BTC options’</w:t>
+      </w:r>
+      <w:r>
+        <w:t xml:space="preserve"> </w:t>
+      </w:r>
+      <w:r>
+        <w:rPr>
+          <w:i/>
+          <w:iCs/>
+        </w:rPr>
+        <w:t xml:space="preserve">implied</w:t>
+      </w:r>
+      <w:r>
+        <w:t xml:space="preserve"> </w:t>
+      </w:r>
+      <w:r>
+        <w:t xml:space="preserve">volatility at a matching ~7-day tenor (e.g. on Deribit) turns it into a trading signal in its own right. If implied volatility trades meaningfully above 6.07%, the options market is pricing in more risk than the model expects to realize — a short-volatility position (selling options, or a variance swap) becomes interesting. If implied trades below it, the model is flagging underpriced risk.</w:t>
+      </w:r>
+    </w:p>
+    <w:p>
+      <w:pPr>
+        <w:pStyle w:val="BodyText"/>
+      </w:pPr>
+      <w:r>
+        <w:rPr>
+          <w:b/>
+          <w:bCs/>
+        </w:rPr>
+        <w:t xml:space="preserve">Why this is one input, not the risk number.</w:t>
+      </w:r>
+      <w:r>
+        <w:t xml:space="preserve"> </w:t>
+      </w:r>
+      <w:r>
+        <w:t xml:space="preserve">A live R² of 0.1779 means roughly 18% of the variance in realized volatility is explained — a real, modest edge over a naive guess, not a high-confidence forecast. A live MAPE of 27.18% means the typical forecast error is over a quarter of the value itself: the $82,200 VaR figure above could plausibly be $60,000 or $110,000 purely from model error, before the market has even moved. The model is also entirely backward-looking, built from OHLCV price history alone — it has no way to anticipate a regulatory headline, an exchange failure, or a macro shock, exactly the kind of jump risk that actually drives large drawdowns. And GARCH, the more conventional econometric volatility model, failed outright at this same horizon in this project (R² = −110.68 live) — a reminder that the</w:t>
+      </w:r>
+      <w:r>
+        <w:t xml:space="preserve"> </w:t>
+      </w:r>
+      <w:r>
+        <w:t xml:space="preserve">“textbook”</w:t>
+      </w:r>
+      <w:r>
+        <w:t xml:space="preserve"> </w:t>
+      </w:r>
+      <w:r>
+        <w:t xml:space="preserve">choice here would have been actively dangerous, not merely mediocre. A real risk desk would blend this forecast with implied volatility, cross-asset correlation, and a tail-risk stress-test overlay, using it as one component of a broader framework rather than the sole basis for a position.</w:t>
+      </w:r>
+    </w:p>
     <w:bookmarkEnd w:id="69"/>
-    <w:bookmarkStart w:id="72" w:name="limitations-and-future-work"/>
+    <w:bookmarkEnd w:id="70"/>
+    <w:bookmarkStart w:id="73" w:name="limitations-and-future-work"/>
     <w:p>
       <w:pPr>
         <w:pStyle w:val="Heading1"/>
@@ -7676,7 +8127,7 @@
         <w:t xml:space="preserve">12. Limitations and Future Work</w:t>
       </w:r>
     </w:p>
-    <w:bookmarkStart w:id="70" w:name="limitations"/>
+    <w:bookmarkStart w:id="71" w:name="limitations"/>
     <w:p>
       <w:pPr>
         <w:pStyle w:val="Heading2"/>
@@ -8236,8 +8687,8 @@
         <w:t xml:space="preserve">The live-test window is fixed at the moment this notebook is run, not continuously accumulating — re-running it later will naturally score more of the already-elapsed-but-not-yet-scoreable predictions near the end of the current window.</w:t>
       </w:r>
     </w:p>
-    <w:bookmarkEnd w:id="70"/>
-    <w:bookmarkStart w:id="71" w:name="future-improvements"/>
+    <w:bookmarkEnd w:id="71"/>
+    <w:bookmarkStart w:id="72" w:name="future-improvements"/>
     <w:p>
       <w:pPr>
         <w:pStyle w:val="Heading2"/>
@@ -8306,9 +8757,9 @@
         <w:t xml:space="preserve">On-chain metrics (exchange netflows, active addresses) as a genuinely independent information source, distinct from every price-history-derived feature tested so far.</w:t>
       </w:r>
     </w:p>
-    <w:bookmarkEnd w:id="71"/>
     <w:bookmarkEnd w:id="72"/>
-    <w:bookmarkStart w:id="73" w:name="references"/>
+    <w:bookmarkEnd w:id="73"/>
+    <w:bookmarkStart w:id="74" w:name="references"/>
     <w:p>
       <w:pPr>
         <w:pStyle w:val="Heading1"/>
@@ -8497,7 +8948,7 @@
         <w:t xml:space="preserve">Econometrica, 59(2).</w:t>
       </w:r>
     </w:p>
-    <w:bookmarkEnd w:id="73"/>
+    <w:bookmarkEnd w:id="74"/>
     <w:sectPr>
       <w:footnotePr>
         <w:numRestart w:val="eachSect"/>

</xml_diff>

<commit_message>
Add options pricing worked example; simplify both use-case sections
New Section 11.2 (Options Pricing and Volatility Trading Ideas) walks
through the model's forecast as an input to Black-Scholes: converting
to annualized vol, why implied vol (not this model) prices actively-
traded options, and where a realized-vol forecast is actually useful
- OTC pricing with no market quote, and as a relative-value signal
against quoted implied vol. Grounded in the same live forecast as
Section 11.1, with a concrete priced example at three volatility
assumptions.

Both 11.1 and 11.2 rewritten in plain language - no formulas, no
Greek-letter notation, no jargon like "Jensen's inequality" or
"delta-hedge" - so the risk/pricing mechanics are accessible to a
non-quant reader while keeping the real numbers behind them.

Co-Authored-By: Claude Sonnet 5 <noreply@anthropic.com>
</commit_message>
<xml_diff>
--- a/docs/capstone-btc-volatility-report.docx
+++ b/docs/capstone-btc-volatility-report.docx
@@ -7617,7 +7617,7 @@
     </w:p>
     <w:bookmarkEnd w:id="67"/>
     <w:bookmarkEnd w:id="68"/>
-    <w:bookmarkStart w:id="70" w:name="conclusion"/>
+    <w:bookmarkStart w:id="71" w:name="conclusion"/>
     <w:p>
       <w:pPr>
         <w:pStyle w:val="Heading1"/>
@@ -7680,363 +7680,59 @@
         <w:pStyle w:val="FirstParagraph"/>
       </w:pPr>
       <w:r>
-        <w:t xml:space="preserve">Section 1.3 named Value-at-Risk and position sizing as downstream use cases in the abstract. This section makes that concrete, using the model’s own most recent live forecast rather than a hypothetical number: on 2026-08-25, HAR-RV-X’s kept model forecast</w:t>
-      </w:r>
-      <w:r>
-        <w:t xml:space="preserve"> </w:t>
-      </w:r>
-      <w:r>
-        <w:rPr>
-          <w:rStyle w:val="VerbatimChar"/>
-        </w:rPr>
-        <w:t xml:space="preserve">volatility_7d = 0.004685</w:t>
-      </w:r>
-      <w:r>
-        <w:t xml:space="preserve"> </w:t>
-      </w:r>
-      <w:r>
-        <w:t xml:space="preserve">— a predicted standard deviation of</w:t>
-      </w:r>
-      <w:r>
-        <w:t xml:space="preserve"> </w:t>
-      </w:r>
-      <w:r>
-        <w:rPr>
-          <w:i/>
-          <w:iCs/>
-        </w:rPr>
-        <w:t xml:space="preserve">hourly</w:t>
-      </w:r>
-      <w:r>
-        <w:t xml:space="preserve"> </w:t>
-      </w:r>
-      <w:r>
-        <w:t xml:space="preserve">returns over the coming 7 days.</w:t>
+        <w:t xml:space="preserve">Section 1.3 named risk management as a direct use case for this model. Here is what that looks like in practice, using the model’s real, most recent forecast rather than a made-up number.</w:t>
       </w:r>
     </w:p>
     <w:p>
       <w:pPr>
         <w:pStyle w:val="BodyText"/>
       </w:pPr>
+      <w:r>
+        <w:t xml:space="preserve">On 2026-08-25, the model predicted that BTC’s typical hourly price swing over the coming week would be about 0.47%. Scaled up to cover a full 7-day holding period, that works out to an expected price move of roughly</w:t>
+      </w:r>
+      <w:r>
+        <w:t xml:space="preserve"> </w:t>
+      </w:r>
       <w:r>
         <w:rPr>
           <w:b/>
           <w:bCs/>
         </w:rPr>
-        <w:t xml:space="preserve">Step 1 — scale to the trade’s horizon.</w:t>
-      </w:r>
-      <w:r>
-        <w:t xml:space="preserve"> </w:t>
-      </w:r>
-      <w:r>
-        <w:t xml:space="preserve">A 7-day directional position needs 7-day σ, not hourly σ. Scaling by √time (treating hourly returns as approximately independent over the window):</w:t>
+        <w:t xml:space="preserve">6% over the week</w:t>
+      </w:r>
+      <w:r>
+        <w:t xml:space="preserve">.</w:t>
       </w:r>
     </w:p>
     <w:p>
       <w:pPr>
         <w:pStyle w:val="BodyText"/>
-      </w:pPr>
-      <m:oMathPara>
-        <m:oMathParaPr>
-          <m:jc m:val="center"/>
-        </m:oMathParaPr>
-        <m:oMath>
-          <m:sSub>
-            <m:e>
-              <m:r>
-                <m:t>σ</m:t>
-              </m:r>
-            </m:e>
-            <m:sub>
-              <m:r>
-                <m:t>7</m:t>
-              </m:r>
-              <m:r>
-                <m:t>d</m:t>
-              </m:r>
-            </m:sub>
-          </m:sSub>
-          <m:r>
-            <m:rPr>
-              <m:sty m:val="p"/>
-            </m:rPr>
-            <m:t>=</m:t>
-          </m:r>
-          <m:r>
-            <m:t>0.004685</m:t>
-          </m:r>
-          <m:r>
-            <m:rPr>
-              <m:sty m:val="p"/>
-            </m:rPr>
-            <m:t>×</m:t>
-          </m:r>
-          <m:rad>
-            <m:radPr>
-              <m:degHide m:val="on"/>
-            </m:radPr>
-            <m:deg/>
-            <m:e>
-              <m:r>
-                <m:t>168</m:t>
-              </m:r>
-            </m:e>
-          </m:rad>
-          <m:r>
-            <m:rPr>
-              <m:sty m:val="p"/>
-            </m:rPr>
-            <m:t>≈</m:t>
-          </m:r>
-          <m:r>
-            <m:t>6.07</m:t>
-          </m:r>
-          <m:r>
-            <m:rPr>
-              <m:sty m:val="p"/>
-            </m:rPr>
-            <m:t>%</m:t>
-          </m:r>
-        </m:oMath>
-      </m:oMathPara>
-    </w:p>
-    <w:p>
-      <w:pPr>
-        <w:pStyle w:val="FirstParagraph"/>
       </w:pPr>
       <w:r>
         <w:rPr>
           <w:b/>
           <w:bCs/>
         </w:rPr>
-        <w:t xml:space="preserve">Step 2 — size the position off a risk budget, not a price target.</w:t>
-      </w:r>
-      <w:r>
-        <w:t xml:space="preserve"> </w:t>
-      </w:r>
-      <w:r>
-        <w:t xml:space="preserve">Suppose a desk is willing to risk $50,000 (one standard deviation) on a 7-day BTC position:</w:t>
-      </w:r>
-    </w:p>
-    <w:p>
-      <w:pPr>
-        <w:pStyle w:val="BodyText"/>
-      </w:pPr>
-      <m:oMathPara>
-        <m:oMathParaPr>
-          <m:jc m:val="center"/>
-        </m:oMathParaPr>
-        <m:oMath>
-          <m:r>
-            <m:rPr>
-              <m:nor/>
-              <m:sty m:val="p"/>
-            </m:rPr>
-            <m:t>Notional</m:t>
-          </m:r>
-          <m:r>
-            <m:rPr>
-              <m:sty m:val="p"/>
-            </m:rPr>
-            <m:t>=</m:t>
-          </m:r>
-          <m:f>
-            <m:fPr>
-              <m:type m:val="bar"/>
-            </m:fPr>
-            <m:num>
-              <m:r>
-                <m:rPr>
-                  <m:sty m:val="p"/>
-                </m:rPr>
-                <m:t>$</m:t>
-              </m:r>
-              <m:r>
-                <m:t>50</m:t>
-              </m:r>
-              <m:r>
-                <m:rPr>
-                  <m:sty m:val="p"/>
-                </m:rPr>
-                <m:t>,</m:t>
-              </m:r>
-              <m:r>
-                <m:t>000</m:t>
-              </m:r>
-            </m:num>
-            <m:den>
-              <m:r>
-                <m:t>0.0607</m:t>
-              </m:r>
-            </m:den>
-          </m:f>
-          <m:r>
-            <m:rPr>
-              <m:sty m:val="p"/>
-            </m:rPr>
-            <m:t>≈</m:t>
-          </m:r>
-          <m:r>
-            <m:rPr>
-              <m:sty m:val="p"/>
-            </m:rPr>
-            <m:t>$</m:t>
-          </m:r>
-          <m:r>
-            <m:t>823</m:t>
-          </m:r>
-          <m:r>
-            <m:rPr>
-              <m:sty m:val="p"/>
-            </m:rPr>
-            <m:t>,</m:t>
-          </m:r>
-          <m:r>
-            <m:t>000</m:t>
-          </m:r>
-        </m:oMath>
-      </m:oMathPara>
-    </w:p>
-    <w:p>
-      <w:pPr>
-        <w:pStyle w:val="FirstParagraph"/>
-      </w:pPr>
-      <w:r>
-        <w:t xml:space="preserve">A larger forecasted σ shrinks the position automatically — this is the actual mechanism behind volatility targeting: the model doesn’t predict direction, it sizes exposure so realized risk stays roughly constant regardless of how turbulent the market currently is.</w:t>
-      </w:r>
-    </w:p>
-    <w:p>
-      <w:pPr>
-        <w:pStyle w:val="BodyText"/>
-      </w:pPr>
+        <w:t xml:space="preserve">Sizing a position.</w:t>
+      </w:r>
+      <w:r>
+        <w:t xml:space="preserve"> </w:t>
+      </w:r>
+      <w:r>
+        <w:t xml:space="preserve">Suppose a trading desk wants to risk no more than $50,000 on a 7-day Bitcoin trade. If the model expects the price to move about 6% in a typical week, the desk can work backward to a position size: risking $50,000 on a trade expected to move 6% points to a position worth about</w:t>
+      </w:r>
+      <w:r>
+        <w:t xml:space="preserve"> </w:t>
+      </w:r>
       <w:r>
         <w:rPr>
           <w:b/>
           <w:bCs/>
         </w:rPr>
-        <w:t xml:space="preserve">Step 3 — turn that into a VaR figure.</w:t>
-      </w:r>
-      <w:r>
-        <w:t xml:space="preserve"> </w:t>
-      </w:r>
-      <w:r>
-        <w:t xml:space="preserve">95% one-week Value-at-Risk on the resulting position:</w:t>
-      </w:r>
-    </w:p>
-    <w:p>
-      <w:pPr>
-        <w:pStyle w:val="BodyText"/>
-      </w:pPr>
-      <m:oMathPara>
-        <m:oMathParaPr>
-          <m:jc m:val="center"/>
-        </m:oMathParaPr>
-        <m:oMath>
-          <m:r>
-            <m:t>V</m:t>
-          </m:r>
-          <m:r>
-            <m:t>a</m:t>
-          </m:r>
-          <m:sSub>
-            <m:e>
-              <m:r>
-                <m:t>R</m:t>
-              </m:r>
-            </m:e>
-            <m:sub>
-              <m:r>
-                <m:t>95</m:t>
-              </m:r>
-            </m:sub>
-          </m:sSub>
-          <m:r>
-            <m:rPr>
-              <m:sty m:val="p"/>
-            </m:rPr>
-            <m:t>=</m:t>
-          </m:r>
-          <m:r>
-            <m:rPr>
-              <m:sty m:val="p"/>
-            </m:rPr>
-            <m:t>$</m:t>
-          </m:r>
-          <m:r>
-            <m:t>823</m:t>
-          </m:r>
-          <m:r>
-            <m:rPr>
-              <m:sty m:val="p"/>
-            </m:rPr>
-            <m:t>,</m:t>
-          </m:r>
-          <m:r>
-            <m:t>000</m:t>
-          </m:r>
-          <m:r>
-            <m:rPr>
-              <m:sty m:val="p"/>
-            </m:rPr>
-            <m:t>×</m:t>
-          </m:r>
-          <m:r>
-            <m:t>0.0607</m:t>
-          </m:r>
-          <m:r>
-            <m:rPr>
-              <m:sty m:val="p"/>
-            </m:rPr>
-            <m:t>×</m:t>
-          </m:r>
-          <m:r>
-            <m:t>1.645</m:t>
-          </m:r>
-          <m:r>
-            <m:rPr>
-              <m:sty m:val="p"/>
-            </m:rPr>
-            <m:t>≈</m:t>
-          </m:r>
-          <m:r>
-            <m:rPr>
-              <m:sty m:val="p"/>
-            </m:rPr>
-            <m:t>$</m:t>
-          </m:r>
-          <m:r>
-            <m:t>82</m:t>
-          </m:r>
-          <m:r>
-            <m:rPr>
-              <m:sty m:val="p"/>
-            </m:rPr>
-            <m:t>,</m:t>
-          </m:r>
-          <m:r>
-            <m:t>200</m:t>
-          </m:r>
-        </m:oMath>
-      </m:oMathPara>
-    </w:p>
-    <w:p>
-      <w:pPr>
-        <w:pStyle w:val="FirstParagraph"/>
-      </w:pPr>
-      <w:r>
-        <w:t xml:space="preserve">— read as</w:t>
-      </w:r>
-      <w:r>
-        <w:t xml:space="preserve"> </w:t>
-      </w:r>
-      <w:r>
-        <w:t xml:space="preserve">“a 5% chance of losing more than $82,200 over the next 7 days,”</w:t>
-      </w:r>
-      <w:r>
-        <w:t xml:space="preserve"> </w:t>
-      </w:r>
-      <w:r>
-        <w:t xml:space="preserve">the figure that would actually appear in a risk report.</w:t>
+        <w:t xml:space="preserve">$823,000</w:t>
+      </w:r>
+      <w:r>
+        <w:t xml:space="preserve">. The higher the forecasted volatility, the smaller the position this points to — that is the core idea behind volatility-based position sizing. The model does not say which way the price will go, only how big a bet to make so the risk stays roughly consistent whether the market is calm or wild.</w:t>
       </w:r>
     </w:p>
     <w:p>
@@ -8048,77 +7744,212 @@
           <w:b/>
           <w:bCs/>
         </w:rPr>
-        <w:t xml:space="preserve">Step 4 — a volatility-arbitrage angle.</w:t>
-      </w:r>
-      <w:r>
-        <w:t xml:space="preserve"> </w:t>
-      </w:r>
-      <w:r>
-        <w:t xml:space="preserve">This is a</w:t>
-      </w:r>
-      <w:r>
-        <w:t xml:space="preserve"> </w:t>
-      </w:r>
-      <w:r>
-        <w:rPr>
-          <w:i/>
-          <w:iCs/>
-        </w:rPr>
-        <w:t xml:space="preserve">realized</w:t>
-      </w:r>
-      <w:r>
-        <w:t xml:space="preserve">-volatility forecast; comparing it against BTC options’</w:t>
-      </w:r>
-      <w:r>
-        <w:t xml:space="preserve"> </w:t>
-      </w:r>
-      <w:r>
-        <w:rPr>
-          <w:i/>
-          <w:iCs/>
-        </w:rPr>
-        <w:t xml:space="preserve">implied</w:t>
-      </w:r>
-      <w:r>
-        <w:t xml:space="preserve"> </w:t>
-      </w:r>
-      <w:r>
-        <w:t xml:space="preserve">volatility at a matching ~7-day tenor (e.g. on Deribit) turns it into a trading signal in its own right. If implied volatility trades meaningfully above 6.07%, the options market is pricing in more risk than the model expects to realize — a short-volatility position (selling options, or a variance swap) becomes interesting. If implied trades below it, the model is flagging underpriced risk.</w:t>
-      </w:r>
-    </w:p>
-    <w:p>
-      <w:pPr>
-        <w:pStyle w:val="BodyText"/>
-      </w:pPr>
+        <w:t xml:space="preserve">Estimating potential losses.</w:t>
+      </w:r>
+      <w:r>
+        <w:t xml:space="preserve"> </w:t>
+      </w:r>
+      <w:r>
+        <w:t xml:space="preserve">Once the position size is set, the same forecast turns into a plain risk statement: on an $823,000 position with an expected 6% weekly swing, there is roughly a 5% chance of losing more than about</w:t>
+      </w:r>
+      <w:r>
+        <w:t xml:space="preserve"> </w:t>
+      </w:r>
       <w:r>
         <w:rPr>
           <w:b/>
           <w:bCs/>
         </w:rPr>
-        <w:t xml:space="preserve">Why this is one input, not the risk number.</w:t>
-      </w:r>
-      <w:r>
-        <w:t xml:space="preserve"> </w:t>
-      </w:r>
-      <w:r>
-        <w:t xml:space="preserve">A live R² of 0.1779 means roughly 18% of the variance in realized volatility is explained — a real, modest edge over a naive guess, not a high-confidence forecast. A live MAPE of 27.18% means the typical forecast error is over a quarter of the value itself: the $82,200 VaR figure above could plausibly be $60,000 or $110,000 purely from model error, before the market has even moved. The model is also entirely backward-looking, built from OHLCV price history alone — it has no way to anticipate a regulatory headline, an exchange failure, or a macro shock, exactly the kind of jump risk that actually drives large drawdowns. And GARCH, the more conventional econometric volatility model, failed outright at this same horizon in this project (R² = −110.68 live) — a reminder that the</w:t>
-      </w:r>
-      <w:r>
-        <w:t xml:space="preserve"> </w:t>
-      </w:r>
-      <w:r>
-        <w:t xml:space="preserve">“textbook”</w:t>
-      </w:r>
-      <w:r>
-        <w:t xml:space="preserve"> </w:t>
-      </w:r>
-      <w:r>
-        <w:t xml:space="preserve">choice here would have been actively dangerous, not merely mediocre. A real risk desk would blend this forecast with implied volatility, cross-asset correlation, and a tail-risk stress-test overlay, using it as one component of a broader framework rather than the sole basis for a position.</w:t>
+        <w:t xml:space="preserve">$82,000</w:t>
+      </w:r>
+      <w:r>
+        <w:t xml:space="preserve"> </w:t>
+      </w:r>
+      <w:r>
+        <w:t xml:space="preserve">over the week. That is the kind of number that goes directly into a risk report.</w:t>
+      </w:r>
+    </w:p>
+    <w:p>
+      <w:pPr>
+        <w:pStyle w:val="BodyText"/>
+      </w:pPr>
+      <w:r>
+        <w:rPr>
+          <w:b/>
+          <w:bCs/>
+        </w:rPr>
+        <w:t xml:space="preserve">A trading idea.</w:t>
+      </w:r>
+      <w:r>
+        <w:t xml:space="preserve"> </w:t>
+      </w:r>
+      <w:r>
+        <w:t xml:space="preserve">Because this model forecasts how much BTC will actually move, it can be compared against how much the options market currently thinks BTC will move. If the options market is pricing in much more movement than the model expects, that is a signal those options may be overpriced — worth investigating further before trading.</w:t>
+      </w:r>
+    </w:p>
+    <w:p>
+      <w:pPr>
+        <w:pStyle w:val="BodyText"/>
+      </w:pPr>
+      <w:r>
+        <w:rPr>
+          <w:b/>
+          <w:bCs/>
+        </w:rPr>
+        <w:t xml:space="preserve">Why this is a helpful input, not the final answer.</w:t>
+      </w:r>
+      <w:r>
+        <w:t xml:space="preserve"> </w:t>
+      </w:r>
+      <w:r>
+        <w:t xml:space="preserve">The model gets it right often enough to be useful — it explains roughly 18% of the real ups and downs in volatility — but that also means most of it goes unexplained. Forecast errors of around a quarter of the predicted value are common, so the $82,000 risk estimate above could easily turn out to be $60,000 or $110,000 in reality. The model also only looks at past price data — it has no way to know about a surprise news event, an exchange collapse, or new regulation, which are often exactly the things that cause the biggest price swings. A more traditional volatility model (GARCH) was tested in this project and performed far worse over this same time horizon, so this model is a genuine improvement — but a real trading desk would still treat it as one input among several, not the whole risk picture.</w:t>
       </w:r>
     </w:p>
     <w:bookmarkEnd w:id="69"/>
+    <w:bookmarkStart w:id="70" w:name="X6def088e5ea72286a89d62509b3db98cc6422fc"/>
+    <w:p>
+      <w:pPr>
+        <w:pStyle w:val="Heading2"/>
+      </w:pPr>
+      <w:r>
+        <w:t xml:space="preserve">11.2 Worked Example: Options Pricing and Volatility Trading Ideas</w:t>
+      </w:r>
+    </w:p>
+    <w:p>
+      <w:pPr>
+        <w:pStyle w:val="FirstParagraph"/>
+      </w:pPr>
+      <w:r>
+        <w:t xml:space="preserve">Options prices depend heavily on how much the underlying asset is expected to move — the volatility input Section 1.3 mentioned. But there is an important distinction: when an option is already actively traded, its price already reflects the market’s own built-in guess about future volatility. A trader does not usually override that market guess with their own model - instead, they compare their own forecast to the market’s guess and look for cases where the two disagree.</w:t>
+      </w:r>
+    </w:p>
+    <w:p>
+      <w:pPr>
+        <w:pStyle w:val="BodyText"/>
+      </w:pPr>
+      <w:r>
+        <w:t xml:space="preserve">This model’s forecast is useful in two situations. First, when there is no active market to reference at all - a custom or one-off options contract, for example - someone still has to estimate future volatility to arrive at a fair price, and a real forecasting model is a better starting point than simply assuming the future will look like the recent past. Second, even when an active options market exists, the model’s forecast can be compared against the market’s own pricing to spot options that look too expensive or too cheap.</w:t>
+      </w:r>
+    </w:p>
+    <w:p>
+      <w:pPr>
+        <w:pStyle w:val="BodyText"/>
+      </w:pPr>
+      <w:r>
+        <w:rPr>
+          <w:b/>
+          <w:bCs/>
+        </w:rPr>
+        <w:t xml:space="preserve">A concrete example.</w:t>
+      </w:r>
+      <w:r>
+        <w:t xml:space="preserve"> </w:t>
+      </w:r>
+      <w:r>
+        <w:t xml:space="preserve">Using the model’s real forecast from 2026-08-25 and BTC’s most recent recorded price of about $87,650: the model’s short-term volatility forecast, converted into the kind of yearly volatility figure options pricing normally uses, comes out to about</w:t>
+      </w:r>
+      <w:r>
+        <w:t xml:space="preserve"> </w:t>
+      </w:r>
+      <w:r>
+        <w:rPr>
+          <w:b/>
+          <w:bCs/>
+        </w:rPr>
+        <w:t xml:space="preserve">44%</w:t>
+      </w:r>
+      <w:r>
+        <w:t xml:space="preserve">.</w:t>
+      </w:r>
+    </w:p>
+    <w:p>
+      <w:pPr>
+        <w:pStyle w:val="BodyText"/>
+      </w:pPr>
+      <w:r>
+        <w:t xml:space="preserve">Pricing a hypothetical 7-day BTC option using that 44% figure gives a fair value of about</w:t>
+      </w:r>
+      <w:r>
+        <w:t xml:space="preserve"> </w:t>
+      </w:r>
+      <w:r>
+        <w:rPr>
+          <w:b/>
+          <w:bCs/>
+        </w:rPr>
+        <w:t xml:space="preserve">$1,177</w:t>
+      </w:r>
+      <w:r>
+        <w:t xml:space="preserve">. If the options market were instead pricing that same option using a volatility assumption of 50%, the market price would come out closer to</w:t>
+      </w:r>
+      <w:r>
+        <w:t xml:space="preserve"> </w:t>
+      </w:r>
+      <w:r>
+        <w:rPr>
+          <w:b/>
+          <w:bCs/>
+        </w:rPr>
+        <w:t xml:space="preserve">$1,454</w:t>
+      </w:r>
+      <w:r>
+        <w:t xml:space="preserve"> </w:t>
+      </w:r>
+      <w:r>
+        <w:t xml:space="preserve">- about $280 more expensive than what the model suggests is fair. If the market were pricing it using a lower volatility assumption of 35% instead, the price would be closer to</w:t>
+      </w:r>
+      <w:r>
+        <w:t xml:space="preserve"> </w:t>
+      </w:r>
+      <w:r>
+        <w:rPr>
+          <w:b/>
+          <w:bCs/>
+        </w:rPr>
+        <w:t xml:space="preserve">$792</w:t>
+      </w:r>
+      <w:r>
+        <w:t xml:space="preserve"> </w:t>
+      </w:r>
+      <w:r>
+        <w:t xml:space="preserve">- about $385 cheaper.</w:t>
+      </w:r>
+    </w:p>
+    <w:p>
+      <w:pPr>
+        <w:pStyle w:val="BodyText"/>
+      </w:pPr>
+      <w:r>
+        <w:t xml:space="preserve">The trading idea here is not</w:t>
+      </w:r>
+      <w:r>
+        <w:t xml:space="preserve"> </w:t>
+      </w:r>
+      <w:r>
+        <w:t xml:space="preserve">“use the model’s price instead of the market’s”</w:t>
+      </w:r>
+      <w:r>
+        <w:t xml:space="preserve"> </w:t>
+      </w:r>
+      <w:r>
+        <w:t xml:space="preserve">- it is</w:t>
+      </w:r>
+      <w:r>
+        <w:t xml:space="preserve"> </w:t>
+      </w:r>
+      <w:r>
+        <w:t xml:space="preserve">“if the market looks like the more expensive scenario, the option may be overpriced relative to what this model expects to happen, which could be worth selling; if it looks like the cheaper scenario, it may be underpriced, which could be worth buying.”</w:t>
+      </w:r>
+      <w:r>
+        <w:t xml:space="preserve"> </w:t>
+      </w:r>
+      <w:r>
+        <w:t xml:space="preserve">As with the risk example above, the model is only right often enough to be a useful signal, not a guarantee - so an idea like this would be sized carefully and combined with other information, never acted on by itself.</w:t>
+      </w:r>
+    </w:p>
     <w:bookmarkEnd w:id="70"/>
-    <w:bookmarkStart w:id="73" w:name="limitations-and-future-work"/>
+    <w:bookmarkEnd w:id="71"/>
+    <w:bookmarkStart w:id="74" w:name="limitations-and-future-work"/>
     <w:p>
       <w:pPr>
         <w:pStyle w:val="Heading1"/>
@@ -8127,7 +7958,7 @@
         <w:t xml:space="preserve">12. Limitations and Future Work</w:t>
       </w:r>
     </w:p>
-    <w:bookmarkStart w:id="71" w:name="limitations"/>
+    <w:bookmarkStart w:id="72" w:name="limitations"/>
     <w:p>
       <w:pPr>
         <w:pStyle w:val="Heading2"/>
@@ -8687,8 +8518,8 @@
         <w:t xml:space="preserve">The live-test window is fixed at the moment this notebook is run, not continuously accumulating — re-running it later will naturally score more of the already-elapsed-but-not-yet-scoreable predictions near the end of the current window.</w:t>
       </w:r>
     </w:p>
-    <w:bookmarkEnd w:id="71"/>
-    <w:bookmarkStart w:id="72" w:name="future-improvements"/>
+    <w:bookmarkEnd w:id="72"/>
+    <w:bookmarkStart w:id="73" w:name="future-improvements"/>
     <w:p>
       <w:pPr>
         <w:pStyle w:val="Heading2"/>
@@ -8757,9 +8588,9 @@
         <w:t xml:space="preserve">On-chain metrics (exchange netflows, active addresses) as a genuinely independent information source, distinct from every price-history-derived feature tested so far.</w:t>
       </w:r>
     </w:p>
-    <w:bookmarkEnd w:id="72"/>
     <w:bookmarkEnd w:id="73"/>
-    <w:bookmarkStart w:id="74" w:name="references"/>
+    <w:bookmarkEnd w:id="74"/>
+    <w:bookmarkStart w:id="75" w:name="references"/>
     <w:p>
       <w:pPr>
         <w:pStyle w:val="Heading1"/>
@@ -8948,7 +8779,7 @@
         <w:t xml:space="preserve">Econometrica, 59(2).</w:t>
       </w:r>
     </w:p>
-    <w:bookmarkEnd w:id="74"/>
+    <w:bookmarkEnd w:id="75"/>
     <w:sectPr>
       <w:footnotePr>
         <w:numRestart w:val="eachSect"/>

</xml_diff>

<commit_message>
Add the two worked-example slides to the report as an appendix
New Appendix section reproduces the deck's two new slides (Sizing a
Trade, Pricing an Option) as embedded images, captioned with a
cross-reference back to report Sections 11.1/11.2. Rendered from the
actual committed presentation.pptx, not a separate copy, so the
appendix always matches what's in the deck.

Co-Authored-By: Claude Sonnet 5 <noreply@anthropic.com>
</commit_message>
<xml_diff>
--- a/docs/capstone-btc-volatility-report.docx
+++ b/docs/capstone-btc-volatility-report.docx
@@ -8780,6 +8780,143 @@
       </w:r>
     </w:p>
     <w:bookmarkEnd w:id="75"/>
+    <w:bookmarkStart w:id="82" w:name="X3a1c5ea00ba3cf55bd607c6a3e92bea18af39c0"/>
+    <w:p>
+      <w:pPr>
+        <w:pStyle w:val="Heading1"/>
+      </w:pPr>
+      <w:r>
+        <w:t xml:space="preserve">Appendix: Presentation Slides for Sections 11.1–11.2</w:t>
+      </w:r>
+    </w:p>
+    <w:p>
+      <w:pPr>
+        <w:pStyle w:val="FirstParagraph"/>
+      </w:pPr>
+      <w:r>
+        <w:t xml:space="preserve">The two worked examples in Section 11 were also built as standalone presentation slides, reproduced here exactly as delivered (</w:t>
+      </w:r>
+      <w:r>
+        <w:rPr>
+          <w:rStyle w:val="VerbatimChar"/>
+        </w:rPr>
+        <w:t xml:space="preserve">presentation/capstone-btc-volatility.pptx</w:t>
+      </w:r>
+      <w:r>
+        <w:t xml:space="preserve">, slides 15–16).</w:t>
+      </w:r>
+    </w:p>
+    <w:p>
+      <w:pPr>
+        <w:pStyle w:val="CaptionedFigure"/>
+      </w:pPr>
+      <w:r>
+        <w:drawing>
+          <wp:inline>
+            <wp:extent cx="5334000" cy="2998875"/>
+            <wp:effectExtent b="0" l="0" r="0" t="0"/>
+            <wp:docPr descr="Presentation slide accompanying Section 11.1 — Worked Example: Position Sizing and Value-at-Risk." title="" id="77" name="Picture"/>
+            <a:graphic>
+              <a:graphicData uri="http://schemas.openxmlformats.org/drawingml/2006/picture">
+                <pic:pic>
+                  <pic:nvPicPr>
+                    <pic:cNvPr descr="/private/tmp/claude-501/-Users-mohammedhejairi-Desktop-capstonefinal/b3c1a674-e894-4f2b-8ae2-db6d3a980c41/scratchpad/appendix_slide_var.jpg" id="78" name="Picture"/>
+                    <pic:cNvPicPr>
+                      <a:picLocks noChangeArrowheads="1" noChangeAspect="1"/>
+                    </pic:cNvPicPr>
+                  </pic:nvPicPr>
+                  <pic:blipFill>
+                    <a:blip r:embed="rId76"/>
+                    <a:stretch>
+                      <a:fillRect/>
+                    </a:stretch>
+                  </pic:blipFill>
+                  <pic:spPr bwMode="auto">
+                    <a:xfrm>
+                      <a:off x="0" y="0"/>
+                      <a:ext cx="5334000" cy="2998875"/>
+                    </a:xfrm>
+                    <a:prstGeom prst="rect">
+                      <a:avLst/>
+                    </a:prstGeom>
+                    <a:noFill/>
+                    <a:ln w="9525">
+                      <a:noFill/>
+                      <a:headEnd/>
+                      <a:tailEnd/>
+                    </a:ln>
+                  </pic:spPr>
+                </pic:pic>
+              </a:graphicData>
+            </a:graphic>
+          </wp:inline>
+        </w:drawing>
+      </w:r>
+    </w:p>
+    <w:p>
+      <w:pPr>
+        <w:pStyle w:val="ImageCaption"/>
+      </w:pPr>
+      <w:r>
+        <w:t xml:space="preserve">Presentation slide accompanying Section 11.1 — Worked Example: Position Sizing and Value-at-Risk.</w:t>
+      </w:r>
+    </w:p>
+    <w:p>
+      <w:pPr>
+        <w:pStyle w:val="CaptionedFigure"/>
+      </w:pPr>
+      <w:r>
+        <w:drawing>
+          <wp:inline>
+            <wp:extent cx="5334000" cy="2998875"/>
+            <wp:effectExtent b="0" l="0" r="0" t="0"/>
+            <wp:docPr descr="Presentation slide accompanying Section 11.2 — Worked Example: Options Pricing and Volatility Trading Ideas." title="" id="80" name="Picture"/>
+            <a:graphic>
+              <a:graphicData uri="http://schemas.openxmlformats.org/drawingml/2006/picture">
+                <pic:pic>
+                  <pic:nvPicPr>
+                    <pic:cNvPr descr="/private/tmp/claude-501/-Users-mohammedhejairi-Desktop-capstonefinal/b3c1a674-e894-4f2b-8ae2-db6d3a980c41/scratchpad/appendix_slide_options.jpg" id="81" name="Picture"/>
+                    <pic:cNvPicPr>
+                      <a:picLocks noChangeArrowheads="1" noChangeAspect="1"/>
+                    </pic:cNvPicPr>
+                  </pic:nvPicPr>
+                  <pic:blipFill>
+                    <a:blip r:embed="rId79"/>
+                    <a:stretch>
+                      <a:fillRect/>
+                    </a:stretch>
+                  </pic:blipFill>
+                  <pic:spPr bwMode="auto">
+                    <a:xfrm>
+                      <a:off x="0" y="0"/>
+                      <a:ext cx="5334000" cy="2998875"/>
+                    </a:xfrm>
+                    <a:prstGeom prst="rect">
+                      <a:avLst/>
+                    </a:prstGeom>
+                    <a:noFill/>
+                    <a:ln w="9525">
+                      <a:noFill/>
+                      <a:headEnd/>
+                      <a:tailEnd/>
+                    </a:ln>
+                  </pic:spPr>
+                </pic:pic>
+              </a:graphicData>
+            </a:graphic>
+          </wp:inline>
+        </w:drawing>
+      </w:r>
+    </w:p>
+    <w:p>
+      <w:pPr>
+        <w:pStyle w:val="ImageCaption"/>
+      </w:pPr>
+      <w:r>
+        <w:t xml:space="preserve">Presentation slide accompanying Section 11.2 — Worked Example: Options Pricing and Volatility Trading Ideas.</w:t>
+      </w:r>
+    </w:p>
+    <w:bookmarkEnd w:id="82"/>
     <w:sectPr>
       <w:footnotePr>
         <w:numRestart w:val="eachSect"/>

</xml_diff>

<commit_message>
Propagate Check 19 (Mincer-Zarnowitz R² diagnostic) into report and deck
Report: new paragraph in Section 7.6 documenting the check, plus a
cross-reference from Section 8.1's R² discussion. Deck: new Limitations
bullet on slide 14 noting this notebook's R² is scikit-learn's stricter
convention, and that the literature's own Mincer-Zarnowitz convention
scores the same model higher (0.27 historical / 0.24 live).
</commit_message>
<xml_diff>
--- a/docs/capstone-btc-volatility-report.docx
+++ b/docs/capstone-btc-volatility-report.docx
@@ -4853,6 +4853,32 @@
     <w:bookmarkEnd w:id="49"/>
     <w:bookmarkEnd w:id="50"/>
     <w:bookmarkStart w:id="58" w:name="comparison-metrics-and-final-evaluation"/>
+    <w:p>
+      <w:pPr>
+        <w:pStyle w:val="BodyText"/>
+      </w:pPr>
+      <w:r>
+        <w:rPr>
+          <w:b/>
+        </w:rPr>
+        <w:t>Check 19: does this notebook’s R² match the literature’s own convention?</w:t>
+      </w:r>
+      <w:r>
+        <w:t xml:space="preserve"> </w:t>
+      </w:r>
+      <w:r>
+        <w:t>Every R² reported in this project — Table 1 below, Section 8.1, Section 9, and every check above — comes from scikit-learn’s r2_score (1 − SS_res/SS_tot). The HAR-RV literature this project builds on (Corsi, 2009, and its descendants, including the Mishu 2025 thesis discussed in Sections 7.4.5 and 8.1) conventionally reports a different, related quantity instead: a Mincer-Zarnowitz regression of actual values on predicted values (y_actual = α + β·y_pred + ε, fit by OLS), where an unbiased forecast has α = 0 and β = 1, and the regression’s own R² is reported as the model’s out-of-sample fit. Run on the kept HAR-RV-X model with Newey-West/HAC standard errors (accounting for the autocorrelation that 168-hour-ahead, hourly-origin forecasts have from overlapping windows), the Mincer-Zarnowitz R² comes out higher than scikit-learn’s in both splits — 0.2739 vs. 0.2419 historically, 0.2356 vs. 0.1779 live — because it only measures how well a straight-line fit through the predictions tracks the actuals, not deviation from y_pred = y_actual specifically. Part of the R² gap to externally reported benchmarks is therefore definitional, not just the calendar-window effect already identified in Section 7.4.5. The bias/slope coefficients are a separate, genuine finding: historically, α is small but marginally significant (t = −2.27) and β sits above 1 (1.27, t vs. 1 = 1.87) — mild evidence of prediction compression, underpredicting the largest moves and overpredicting the smallest. Neither departure from unbiasedness is statistically significant on the smaller live-test window (t = −1.06 and 0.77).</w:t>
+      </w:r>
+      <w:r>
+        <w:rPr>
+          <w:b/>
+        </w:rPr>
+        <w:t xml:space="preserve"> Diagnostic only</w:t>
+      </w:r>
+      <w:r>
+        <w:t xml:space="preserve"> — it does not change the kept model.</w:t>
+      </w:r>
+    </w:p>
     <w:p>
       <w:pPr>
         <w:pStyle w:val="Heading1"/>
@@ -5859,6 +5885,9 @@
       </w:r>
       <w:r>
         <w:t xml:space="preserve">on live data than on the historical backtest (0.18 vs. 0.24, Section 9) — is exactly the signature of genuine, if modest, forecasting skill, not an artifact in either direction. (A related question — whether some of that R² comes from evaluating on a compressed log scale rather than genuinely better forecasts — is tested directly in Section 7.4.5, using an external thesis’s much higher reported R² as the prompt; the answer there is no, the improvement survives even when strictly evaluated back on the original scale.)</w:t>
+      </w:r>
+      <w:r>
+        <w:t xml:space="preserve"> (Whether that reported range would look different under this notebook’s own R² convention vs. the literature’s Mincer-Zarnowitz convention is examined directly in Section 7.6, Check 19.)</w:t>
       </w:r>
     </w:p>
     <w:p>

</xml_diff>

<commit_message>
Propagate Checks 20-22 (ARIMA, ARIMAX, LSTM classifier) into report and deck
Report: three new paragraphs in Section 7.6 covering each check's setup,
result, and interpretation - including the LSTM classifier's below-
majority-baseline accuracy finding and its regime-shift diagnosis.

Deck: slide 14's robustness-check count updated to twenty-two, and the
standalone Check 19 bullet consolidated into a combined Checks 19-22
bullet to fit the card without overflow.
</commit_message>
<xml_diff>
--- a/docs/capstone-btc-volatility-report.docx
+++ b/docs/capstone-btc-volatility-report.docx
@@ -4877,6 +4877,57 @@
       </w:r>
       <w:r>
         <w:t xml:space="preserve"> — it does not change the kept model.</w:t>
+      </w:r>
+    </w:p>
+    <w:p>
+      <w:pPr>
+        <w:pStyle w:val="BodyText"/>
+      </w:pPr>
+      <w:r>
+        <w:rPr>
+          <w:b/>
+        </w:rPr>
+        <w:t>Check 20: ARIMA on volatility_7d’s own history.</w:t>
+      </w:r>
+      <w:r>
+        <w:t xml:space="preserve"> </w:t>
+      </w:r>
+      <w:r>
+        <w:t>GARCH above models variance dynamics; HAR-RV-X regresses on volatility at three fixed horizons. ARIMA is the classical alternative to both — autoregressive (AR) and moving-average (MA) terms on volatility_7d’s own history, differenced (I) if AIC prefers it, with no hand-picked regressors at all. Order (3, 0, 2) was selected by AIC on the training period only, then evaluated with a genuine 168-hour-ahead rolling-origin forecast — fixed parameters, one real observation appended at a time as it becomes available, the same leakage-free discipline as GARCH’s own rolling forecast (Section 7.3.3), just looped explicitly since statsmodels has no equivalent to arch’s single vectorized multi-origin call. R² = 0.0358 on HAR-RV-X (Final)’s own test dates — well short of 0.2419. Not adopted: the target’s own autocorrelation structure alone isn’t enough; HAR-RV-X’s three fixed horizons and the promoted EWMA_X/SKEW_X regressors are carrying real information ARIMA has no access to.</w:t>
+      </w:r>
+    </w:p>
+    <w:p>
+      <w:pPr>
+        <w:pStyle w:val="BodyText"/>
+      </w:pPr>
+      <w:r>
+        <w:rPr>
+          <w:b/>
+        </w:rPr>
+        <w:t>Check 21: ARIMAX with HAR-RV-X’s own regressors.</w:t>
+      </w:r>
+      <w:r>
+        <w:t xml:space="preserve"> </w:t>
+      </w:r>
+      <w:r>
+        <w:t>The same six regressors as the kept model (RV_day/RV_week/RV_month, ATR_X, EWMA_X, SKEW_X), fit through SARIMAX instead of Ridge — a regression that also models autocorrelation in its own residuals via ARMA(2, 1, 2) terms (order again selected by AIC on training data only), rather than assuming they are independent noise. One honest simplification is worth flagging: SARIMAX’s own multi-step forecast needs these regressors’ future values too, which — like every other future quantity in this project — are not actually knowable at forecast time; this check holds each regressor at its last known value across the full 168-hour horizon, the same naive-persistence assumption already used elsewhere in this report (Section 7.1), just applied to an input rather than the output. R² = −0.0742 — worse than both HAR-RV-X (Final) and Check 20’s regressor-free ARIMA. Not adopted, and the shortfall relative to Check 20 is itself informative: it is consistent with the constant-future-exog simplification costing more than the regressors add, rather than evidence that the regressors themselves carry no signal — Checks 1 and 13 above already establish separately that HAR-RV-X’s own regressors do help when used the way HAR-RV-X actually uses them.</w:t>
+      </w:r>
+    </w:p>
+    <w:p>
+      <w:pPr>
+        <w:pStyle w:val="BodyText"/>
+      </w:pPr>
+      <w:r>
+        <w:rPr>
+          <w:b/>
+        </w:rPr>
+        <w:t>Check 22: an LSTM classifier for the volatility regime.</w:t>
+      </w:r>
+      <w:r>
+        <w:t xml:space="preserve"> </w:t>
+      </w:r>
+      <w:r>
+        <w:t>Every model elsewhere in this report predicts volatility_7d’s exact value. Volatility clustering (Section 3.5) is fundamentally a statement about regime persistence — calm periods staying calm, turbulent periods staying turbulent — a coarser pattern than the exact number. This check reframes the target as a three-class Low/Moderate/High classification (tertile-split on the training target only, never the test set) and reuses Check 12’s LSTM architecture with a softmax head in place of its regression head. Two points of comparison: a majority-class floor, and — the more informative one — simply thresholding the kept HAR-RV-X (Final) model’s own continuous forecast at the same tertiles. The LSTM classifier scored Accuracy = 0.5036, Macro-F1 = 0.4210; thresholding HAR-RV-X (Final) instead scored Accuracy = 0.6447, Macro-F1 = 0.4425 — HAR-RV-X wins on both. One result is worth a closer look before accepting it at face value: the LSTM’s raw accuracy is actually below the naive majority-class baseline (0.6382). Investigating rather than just reporting it revealed a train/test regime-shift artifact — the classes are tertile-balanced on the training target (33/33/33 by construction), but the test period turned out measurably calmer (a 64/30/6 split under those same thresholds), so a classifier calibrated to expect a roughly even split over-predicts the classes it saw more often in training than the test period’s actual composition warrants; 52% of true-Low test points are misclassified as Moderate. Not adopted — but the diagnosis, not just the negative result, is the finding: Macro-F1 (which does not let a dominant class hide poor performance elsewhere) shows the LSTM did learn real signal (0.4210, well above majority-class’s 0.2597); it simply did not learn more than HAR-RV-X’s own forecast already captures.</w:t>
       </w:r>
     </w:p>
     <w:p>

</xml_diff>

<commit_message>
Remove RSI, EMA spread, Bollinger width, and MACD from the report's current feature set
Mirrors the notebook change: trimmed the Data Dictionary table to the
columns actually in play (ATR/atr_pct kept - it's a real HAR-RV-X
regressor), added a note explaining why the technical-indicator family
is no longer listed, and reframed the EDA/Feature Selection prose to
correctly describe them as tested-and-not-retained (Section 7.6) rather
than part of the current pipeline. Section 7.6's own description of
Check 1, the Abstract, Limitations, and Check 15 sections are untouched -
they're the historical record of what was tried.
</commit_message>
<xml_diff>
--- a/docs/capstone-btc-volatility-report.docx
+++ b/docs/capstone-btc-volatility-report.docx
@@ -1057,76 +1057,6 @@
               <w:pStyle w:val="Compact"/>
             </w:pPr>
             <w:r>
-              <w:t xml:space="preserve">ema_12, ema_26, ema_spread</w:t>
-            </w:r>
-          </w:p>
-        </w:tc>
-        <w:tc>
-          <w:tcPr/>
-          <w:p>
-            <w:pPr>
-              <w:pStyle w:val="Compact"/>
-            </w:pPr>
-            <w:r>
-              <w:t xml:space="preserve">float</w:t>
-            </w:r>
-          </w:p>
-        </w:tc>
-        <w:tc>
-          <w:tcPr/>
-          <w:p>
-            <w:pPr>
-              <w:pStyle w:val="Compact"/>
-            </w:pPr>
-            <w:r>
-              <w:t xml:space="preserve">fast/slow EMA and normalized spread — trend strength</w:t>
-            </w:r>
-          </w:p>
-        </w:tc>
-      </w:tr>
-      <w:tr>
-        <w:tc>
-          <w:tcPr/>
-          <w:p>
-            <w:pPr>
-              <w:pStyle w:val="Compact"/>
-            </w:pPr>
-            <w:r>
-              <w:t xml:space="preserve">rsi_14</w:t>
-            </w:r>
-          </w:p>
-        </w:tc>
-        <w:tc>
-          <w:tcPr/>
-          <w:p>
-            <w:pPr>
-              <w:pStyle w:val="Compact"/>
-            </w:pPr>
-            <w:r>
-              <w:t xml:space="preserve">float</w:t>
-            </w:r>
-          </w:p>
-        </w:tc>
-        <w:tc>
-          <w:tcPr/>
-          <w:p>
-            <w:pPr>
-              <w:pStyle w:val="Compact"/>
-            </w:pPr>
-            <w:r>
-              <w:t xml:space="preserve">14-period Relative Strength Index (0–100)</w:t>
-            </w:r>
-          </w:p>
-        </w:tc>
-      </w:tr>
-      <w:tr>
-        <w:tc>
-          <w:tcPr/>
-          <w:p>
-            <w:pPr>
-              <w:pStyle w:val="Compact"/>
-            </w:pPr>
-            <w:r>
               <w:t xml:space="preserve">atr_14</w:t>
             </w:r>
           </w:p>
@@ -1214,122 +1144,21 @@
           </w:p>
         </w:tc>
       </w:tr>
-      <w:tr>
-        <w:tc>
-          <w:tcPr/>
-          <w:p>
-            <w:pPr>
-              <w:pStyle w:val="Compact"/>
-            </w:pPr>
-            <w:r>
-              <w:t xml:space="preserve">bb_width</w:t>
-            </w:r>
-          </w:p>
-        </w:tc>
-        <w:tc>
-          <w:tcPr/>
-          <w:p>
-            <w:pPr>
-              <w:pStyle w:val="Compact"/>
-            </w:pPr>
-            <w:r>
-              <w:t xml:space="preserve">float</w:t>
-            </w:r>
-          </w:p>
-        </w:tc>
-        <w:tc>
-          <w:tcPr/>
-          <w:p>
-            <w:pPr>
-              <w:pStyle w:val="Compact"/>
-            </w:pPr>
-            <w:r>
-              <w:t xml:space="preserve">Bollinger Band width (20-period) — volatility proxy</w:t>
-            </w:r>
-          </w:p>
-        </w:tc>
-      </w:tr>
-      <w:tr>
-        <w:tc>
-          <w:tcPr/>
-          <w:p>
-            <w:pPr>
-              <w:pStyle w:val="Compact"/>
-            </w:pPr>
-            <w:r>
-              <w:t xml:space="preserve">macd_hist</w:t>
-            </w:r>
-          </w:p>
-        </w:tc>
-        <w:tc>
-          <w:tcPr/>
-          <w:p>
-            <w:pPr>
-              <w:pStyle w:val="Compact"/>
-            </w:pPr>
-            <w:r>
-              <w:t xml:space="preserve">float</w:t>
-            </w:r>
-          </w:p>
-        </w:tc>
-        <w:tc>
-          <w:tcPr/>
-          <w:p>
-            <w:pPr>
-              <w:pStyle w:val="Compact"/>
-            </w:pPr>
-            <w:r>
-              <w:t xml:space="preserve">MACD histogram — momentum-shift signal</w:t>
-            </w:r>
-          </w:p>
-        </w:tc>
-      </w:tr>
     </w:tbl>
     <w:p>
       <w:pPr>
         <w:pStyle w:val="BodyText"/>
       </w:pPr>
       <w:r>
-        <w:t xml:space="preserve">Technical-indicator periods (14, 20, 26) are kept as raw candle counts rather than rescaled for hourly data — standard practice, since</w:t>
-      </w:r>
-      <w:r>
-        <w:t xml:space="preserve"> </w:t>
-      </w:r>
-      <w:r>
-        <w:t xml:space="preserve">“RSI-14”</w:t>
-      </w:r>
-      <w:r>
-        <w:t xml:space="preserve"> </w:t>
-      </w:r>
-      <w:r>
-        <w:t xml:space="preserve">conventionally means the last 14 bars regardless of bar size. Only the target’s own window (</w:t>
-      </w:r>
-      <w:r>
-        <w:rPr>
-          <w:rStyle w:val="VerbatimChar"/>
-        </w:rPr>
-        <w:t xml:space="preserve">volatility_7d</w:t>
-      </w:r>
-      <w:r>
-        <w:t xml:space="preserve">,</w:t>
-      </w:r>
-      <w:r>
-        <w:t xml:space="preserve"> </w:t>
-      </w:r>
-      <w:r>
-        <w:rPr>
-          <w:rStyle w:val="VerbatimChar"/>
-        </w:rPr>
-        <w:t xml:space="preserve">ma_7d</w:t>
-      </w:r>
-      <w:r>
-        <w:t xml:space="preserve">) is explicitly scaled to 168 hourly candles, since its real-world meaning (</w:t>
-      </w:r>
-      <w:r>
-        <w:t xml:space="preserve">“7-day volatility”</w:t>
-      </w:r>
-      <w:r>
-        <w:t xml:space="preserve">) must stay fixed.</w:t>
+        <w:t>A note on what's not in this table: feature engineering also computes RSI, EMA spread, Bollinger width, and MACD - the classic technical-indicator family. They're not listed here because none of them are part of the current, kept feature set: Section 7.6 tests all four directly as HAR-RV-X regressors and finds none move R² meaningfully, so they're not retained going forward. The underlying columns still exist in the data - several robustness checks deliberately reuse them to test other questions - but they're no longer part of what this project actively relies on.</w:t>
+      </w:r>
+    </w:p>
+    <w:p>
+      <w:pPr>
+        <w:pStyle w:val="BodyText"/>
+      </w:pPr>
+      <w:r>
+        <w:t>The atr_14 period (14) is kept as a raw candle count rather than rescaled for hourly data — standard practice, since an indicator period conventionally means the last N bars regardless of bar size. Only the target’s own window (volatility_7d, ma_7d) is explicitly scaled to 168 hourly candles, since its real-world meaning (“7-day volatility”) must stay fixed.</w:t>
       </w:r>
     </w:p>
     <w:bookmarkEnd w:id="16"/>
@@ -1637,88 +1466,7 @@
         <w:pStyle w:val="FirstParagraph"/>
       </w:pPr>
       <w:r>
-        <w:t xml:space="preserve">A correlation matrix across all continuous features against the target shows</w:t>
-      </w:r>
-      <w:r>
-        <w:t xml:space="preserve"> </w:t>
-      </w:r>
-      <w:r>
-        <w:rPr>
-          <w:rStyle w:val="VerbatimChar"/>
-        </w:rPr>
-        <w:t xml:space="preserve">atr_14</w:t>
-      </w:r>
-      <w:r>
-        <w:t xml:space="preserve"> </w:t>
-      </w:r>
-      <w:r>
-        <w:t xml:space="preserve">and</w:t>
-      </w:r>
-      <w:r>
-        <w:t xml:space="preserve"> </w:t>
-      </w:r>
-      <w:r>
-        <w:rPr>
-          <w:rStyle w:val="VerbatimChar"/>
-        </w:rPr>
-        <w:t xml:space="preserve">bb_width</w:t>
-      </w:r>
-      <w:r>
-        <w:t xml:space="preserve"> </w:t>
-      </w:r>
-      <w:r>
-        <w:t xml:space="preserve">— two independent, range-based volatility measures — correlating strongly with</w:t>
-      </w:r>
-      <w:r>
-        <w:t xml:space="preserve"> </w:t>
-      </w:r>
-      <w:r>
-        <w:rPr>
-          <w:rStyle w:val="VerbatimChar"/>
-        </w:rPr>
-        <w:t xml:space="preserve">volatility_7d</w:t>
-      </w:r>
-      <w:r>
-        <w:t xml:space="preserve">, a useful cross-check that the target behaves sensibly.</w:t>
-      </w:r>
-      <w:r>
-        <w:t xml:space="preserve"> </w:t>
-      </w:r>
-      <w:r>
-        <w:rPr>
-          <w:rStyle w:val="VerbatimChar"/>
-        </w:rPr>
-        <w:t xml:space="preserve">rsi_14</w:t>
-      </w:r>
-      <w:r>
-        <w:t xml:space="preserve">,</w:t>
-      </w:r>
-      <w:r>
-        <w:t xml:space="preserve"> </w:t>
-      </w:r>
-      <w:r>
-        <w:rPr>
-          <w:rStyle w:val="VerbatimChar"/>
-        </w:rPr>
-        <w:t xml:space="preserve">ema_spread</w:t>
-      </w:r>
-      <w:r>
-        <w:t xml:space="preserve">, and</w:t>
-      </w:r>
-      <w:r>
-        <w:t xml:space="preserve"> </w:t>
-      </w:r>
-      <w:r>
-        <w:rPr>
-          <w:rStyle w:val="VerbatimChar"/>
-        </w:rPr>
-        <w:t xml:space="preserve">macd_hist</w:t>
-      </w:r>
-      <w:r>
-        <w:t xml:space="preserve"> </w:t>
-      </w:r>
-      <w:r>
-        <w:t xml:space="preserve">correlate more weakly, consistent with their role as leading momentum indicators rather than concurrent volatility measures — and consistent with the Robustness Checks in Section 7.6, where none of them improved the final model.</w:t>
+        <w:t>A correlation matrix across all continuous features against the target shows atr_14 — an independent, range-based volatility measure — correlating strongly with volatility_7d, a useful cross-check that the target behaves sensibly. RSI, EMA spread, Bollinger width, and MACD were also computed and tested directly, and none improved the final model (Robustness Checks, Section 7.6), so they are not part of the current, kept feature set.</w:t>
       </w:r>
     </w:p>
     <w:bookmarkEnd w:id="22"/>
@@ -1761,31 +1509,7 @@
         </w:numPr>
       </w:pPr>
       <w:r>
-        <w:rPr>
-          <w:rStyle w:val="VerbatimChar"/>
-        </w:rPr>
-        <w:t xml:space="preserve">atr_14</w:t>
-      </w:r>
-      <w:r>
-        <w:t xml:space="preserve"> </w:t>
-      </w:r>
-      <w:r>
-        <w:t xml:space="preserve">and</w:t>
-      </w:r>
-      <w:r>
-        <w:t xml:space="preserve"> </w:t>
-      </w:r>
-      <w:r>
-        <w:rPr>
-          <w:rStyle w:val="VerbatimChar"/>
-        </w:rPr>
-        <w:t xml:space="preserve">bb_width</w:t>
-      </w:r>
-      <w:r>
-        <w:t xml:space="preserve"> </w:t>
-      </w:r>
-      <w:r>
-        <w:t xml:space="preserve">cross-validate the target as an independent, range-based volatility signal.</w:t>
+        <w:t>atr_14 cross-validates the target as an independent, range-based volatility signal.</w:t>
       </w:r>
     </w:p>
     <w:p>
@@ -1797,40 +1521,7 @@
         </w:numPr>
       </w:pPr>
       <w:r>
-        <w:rPr>
-          <w:rStyle w:val="VerbatimChar"/>
-        </w:rPr>
-        <w:t xml:space="preserve">rsi_14</w:t>
-      </w:r>
-      <w:r>
-        <w:t xml:space="preserve">,</w:t>
-      </w:r>
-      <w:r>
-        <w:t xml:space="preserve"> </w:t>
-      </w:r>
-      <w:r>
-        <w:rPr>
-          <w:rStyle w:val="VerbatimChar"/>
-        </w:rPr>
-        <w:t xml:space="preserve">ema_spread</w:t>
-      </w:r>
-      <w:r>
-        <w:t xml:space="preserve">, and</w:t>
-      </w:r>
-      <w:r>
-        <w:t xml:space="preserve"> </w:t>
-      </w:r>
-      <w:r>
-        <w:rPr>
-          <w:rStyle w:val="VerbatimChar"/>
-        </w:rPr>
-        <w:t xml:space="preserve">macd_hist</w:t>
-      </w:r>
-      <w:r>
-        <w:t xml:space="preserve"> </w:t>
-      </w:r>
-      <w:r>
-        <w:t xml:space="preserve">are weaker, leading indicators rather than concurrent volatility measures.</w:t>
+        <w:t>RSI, EMA spread, Bollinger width, and MACD were also tested (Section 7.6) but none moved R² meaningfully, so they are not part of the current feature set.</w:t>
       </w:r>
     </w:p>
     <w:p>
@@ -2023,91 +1714,7 @@
         <w:pStyle w:val="FirstParagraph"/>
       </w:pPr>
       <w:r>
-        <w:t xml:space="preserve">Already computed in EDA (Section 3.4). Features with the strongest linear correlation to the target —</w:t>
-      </w:r>
-      <w:r>
-        <w:t xml:space="preserve"> </w:t>
-      </w:r>
-      <w:r>
-        <w:rPr>
-          <w:rStyle w:val="VerbatimChar"/>
-        </w:rPr>
-        <w:t xml:space="preserve">atr_14</w:t>
-      </w:r>
-      <w:r>
-        <w:t xml:space="preserve">,</w:t>
-      </w:r>
-      <w:r>
-        <w:t xml:space="preserve"> </w:t>
-      </w:r>
-      <w:r>
-        <w:rPr>
-          <w:rStyle w:val="VerbatimChar"/>
-        </w:rPr>
-        <w:t xml:space="preserve">bb_width</w:t>
-      </w:r>
-      <w:r>
-        <w:t xml:space="preserve">,</w:t>
-      </w:r>
-      <w:r>
-        <w:t xml:space="preserve"> </w:t>
-      </w:r>
-      <w:r>
-        <w:rPr>
-          <w:rStyle w:val="VerbatimChar"/>
-        </w:rPr>
-        <w:t xml:space="preserve">log_return</w:t>
-      </w:r>
-      <w:r>
-        <w:t xml:space="preserve">,</w:t>
-      </w:r>
-      <w:r>
-        <w:t xml:space="preserve"> </w:t>
-      </w:r>
-      <w:r>
-        <w:rPr>
-          <w:rStyle w:val="VerbatimChar"/>
-        </w:rPr>
-        <w:t xml:space="preserve">volume_chg</w:t>
-      </w:r>
-      <w:r>
-        <w:t xml:space="preserve"> </w:t>
-      </w:r>
-      <w:r>
-        <w:t xml:space="preserve">and their lags — are the primary signal; weaker-correlation features (</w:t>
-      </w:r>
-      <w:r>
-        <w:rPr>
-          <w:rStyle w:val="VerbatimChar"/>
-        </w:rPr>
-        <w:t xml:space="preserve">rsi_14</w:t>
-      </w:r>
-      <w:r>
-        <w:t xml:space="preserve">,</w:t>
-      </w:r>
-      <w:r>
-        <w:t xml:space="preserve"> </w:t>
-      </w:r>
-      <w:r>
-        <w:rPr>
-          <w:rStyle w:val="VerbatimChar"/>
-        </w:rPr>
-        <w:t xml:space="preserve">ema_spread</w:t>
-      </w:r>
-      <w:r>
-        <w:t xml:space="preserve">,</w:t>
-      </w:r>
-      <w:r>
-        <w:t xml:space="preserve"> </w:t>
-      </w:r>
-      <w:r>
-        <w:rPr>
-          <w:rStyle w:val="VerbatimChar"/>
-        </w:rPr>
-        <w:t xml:space="preserve">macd_hist</w:t>
-      </w:r>
-      <w:r>
-        <w:t xml:space="preserve">) were retained through feature engineering and formally tested as HAR-RV-X regressors in Section 7.6 — none improved the model.</w:t>
+        <w:t>Already computed in EDA (Section 3.4). Features with the strongest linear correlation to the target — atr_14, log_return, volume_chg and their lags — are the primary signal. RSI, EMA spread, Bollinger width, and MACD were also computed and formally tested as HAR-RV-X regressors in Section 7.6 — none improved the model, so none are part of the current, kept feature set.</w:t>
       </w:r>
     </w:p>
     <w:bookmarkEnd w:id="26"/>

</xml_diff>

<commit_message>
Remove the Chi-Square Test section from the report
Section 5.2 (hour-of-day vs. volatility regime, chi2=2.68, p=1.000) is
removed to match the notebook, where the underlying analysis cell was
deleted. Fixed the resulting dangling cross-references: the EDA
session-time paragraph and insight bullet no longer point to a chi-square
test that doesn't exist, and Holt-Winters' gamma-approx-0 finding is
now reported standalone instead of "confirming" the removed section.
</commit_message>
<xml_diff>
--- a/docs/capstone-btc-volatility-report.docx
+++ b/docs/capstone-btc-volatility-report.docx
@@ -1433,22 +1433,7 @@
         <w:pStyle w:val="FirstParagraph"/>
       </w:pPr>
       <w:r>
-        <w:t xml:space="preserve">Boxplots of</w:t>
-      </w:r>
-      <w:r>
-        <w:t xml:space="preserve"> </w:t>
-      </w:r>
-      <w:r>
-        <w:rPr>
-          <w:rStyle w:val="VerbatimChar"/>
-        </w:rPr>
-        <w:t xml:space="preserve">volatility_7d</w:t>
-      </w:r>
-      <w:r>
-        <w:t xml:space="preserve"> </w:t>
-      </w:r>
-      <w:r>
-        <w:t xml:space="preserve">against hour-of-day (UTC) and day-of-week test for session-overlap effects (US/Asia/Europe trading hours). This bivariate check feeds directly into the chi-square test in Feature Selection (Section 5).</w:t>
+        <w:t>Boxplots of volatility_7d against hour-of-day (UTC) and day-of-week test for session-overlap effects (US/Asia/Europe trading hours).</w:t>
       </w:r>
     </w:p>
     <w:bookmarkEnd w:id="21"/>
@@ -1545,7 +1530,7 @@
         </w:numPr>
       </w:pPr>
       <w:r>
-        <w:t xml:space="preserve">Session-time boxplots motivate the hour-of-day chi-square test in Feature Selection.</w:t>
+        <w:t>Session-time boxplots show whether hour-of-day or day-of-week patterns exist visually.</w:t>
       </w:r>
     </w:p>
     <w:bookmarkEnd w:id="23"/>
@@ -1719,93 +1704,6 @@
     </w:p>
     <w:bookmarkEnd w:id="26"/>
     <w:bookmarkStart w:id="27" w:name="Xe3685772c82d280a7cff95a26f787321e303407"/>
-    <w:p>
-      <w:pPr>
-        <w:pStyle w:val="Heading2"/>
-      </w:pPr>
-      <w:r>
-        <w:t xml:space="preserve">5.2 Chi-Square Test (Categorical: Hour-of-Day vs. Volatility Regime)</w:t>
-      </w:r>
-    </w:p>
-    <w:p>
-      <w:pPr>
-        <w:pStyle w:val="FirstParagraph"/>
-      </w:pPr>
-      <w:r>
-        <w:rPr>
-          <w:rStyle w:val="VerbatimChar"/>
-        </w:rPr>
-        <w:t xml:space="preserve">volatility_7d</w:t>
-      </w:r>
-      <w:r>
-        <w:t xml:space="preserve"> </w:t>
-      </w:r>
-      <w:r>
-        <w:t xml:space="preserve">was binned into Low/Medium/High terciles — diagnostic only, never used as a modeling feature or target — and tested for association with</w:t>
-      </w:r>
-      <w:r>
-        <w:t xml:space="preserve"> </w:t>
-      </w:r>
-      <w:r>
-        <w:rPr>
-          <w:rStyle w:val="VerbatimChar"/>
-        </w:rPr>
-        <w:t xml:space="preserve">hour_of_day</w:t>
-      </w:r>
-      <w:r>
-        <w:t xml:space="preserve"> </w:t>
-      </w:r>
-      <w:r>
-        <w:t xml:space="preserve">via a chi-square test of independence.</w:t>
-      </w:r>
-    </w:p>
-    <w:p>
-      <w:pPr>
-        <w:pStyle w:val="SourceCode"/>
-      </w:pPr>
-      <w:r>
-        <w:rPr>
-          <w:rStyle w:val="VerbatimChar"/>
-        </w:rPr>
-        <w:t xml:space="preserve">df_clean['vol_bin'] = pd.qcut(df_clean['volatility_7d'], q=3, labels=['Low', 'Medium', 'High'])</w:t>
-      </w:r>
-      <w:r>
-        <w:br/>
-      </w:r>
-      <w:r>
-        <w:rPr>
-          <w:rStyle w:val="VerbatimChar"/>
-        </w:rPr>
-        <w:t xml:space="preserve">contingency = pd.crosstab(df_clean['hour_of_day'], df_clean['vol_bin'])</w:t>
-      </w:r>
-      <w:r>
-        <w:br/>
-      </w:r>
-      <w:r>
-        <w:rPr>
-          <w:rStyle w:val="VerbatimChar"/>
-        </w:rPr>
-        <w:t xml:space="preserve">chi2, p_value, dof, expected = chi2_contingency(contingency)</w:t>
-      </w:r>
-    </w:p>
-    <w:p>
-      <w:pPr>
-        <w:pStyle w:val="FirstParagraph"/>
-      </w:pPr>
-      <w:r>
-        <w:rPr>
-          <w:b/>
-          <w:bCs/>
-        </w:rPr>
-        <w:t xml:space="preserve">Result:</w:t>
-      </w:r>
-      <w:r>
-        <w:t xml:space="preserve"> </w:t>
-      </w:r>
-      <w:r>
-        <w:t xml:space="preserve">χ² = 2.68, dof = 46, p-value = 1.0000. No significant association between hour-of-day and volatility regime (p is essentially 1.0, far above the 0.05 threshold) - despite the visually plausible session-overlap boxplots in EDA, hour-of-day does not carry exploitable information about whether volatility will be Low/Medium/High. This is corroborated independently in the Holt-Winters baseline: its seasonal smoothing parameter converged to gamma = 0.0000, meaning the model itself detected essentially no exploitable daily seasonality.</w:t>
-      </w:r>
-    </w:p>
     <w:bookmarkEnd w:id="27"/>
     <w:bookmarkEnd w:id="28"/>
     <w:bookmarkStart w:id="33" w:name="X27e4506841ec095789c370f6c1a27d542bd6d6d"/>
@@ -2587,17 +2485,7 @@
         <w:pStyle w:val="FirstParagraph"/>
       </w:pPr>
       <w:r>
-        <w:rPr>
-          <w:b/>
-          <w:bCs/>
-        </w:rPr>
-        <w:t xml:space="preserve">Fitted parameters:</w:t>
-      </w:r>
-      <w:r>
-        <w:t xml:space="preserve"> </w:t>
-      </w:r>
-      <w:r>
-        <w:t xml:space="preserve">α (level) = 1.0000, β (trend) = 0.0360, γ (seasonal) = 0.0000. Training AIC = -1,039,809.87. γ ≈ 0 independently confirms the chi-square result in Section 5.2: the model itself found essentially no exploitable seasonal signal.</w:t>
+        <w:t>Fitted parameters: α (level) = 1.0000, β (trend) = 0.0360, γ (seasonal) = 0.0000. Training AIC = -1,039,809.87. γ ≈ 0: the model itself found essentially no exploitable seasonal signal.</w:t>
       </w:r>
     </w:p>
     <w:bookmarkEnd w:id="35"/>

</xml_diff>